<commit_message>
Troca a leitura da carteirinha por OCR local com Docling
- Novo serviço ocr-service (FastAPI + Docling) que devolve o texto da
  foto/PDF em Markdown; roda na infraestrutura do sistema, sem enviar
  imagens a terceiros
- Extrator determinístico (utils/extratorCarteirinha) que acha vacina
  (com apelidos), dose, data, lote e unidade no texto e devolve o
  registro mais recente; testes com texto de exemplo
- /scan/analisar passa a aceitar PDF, responde 503 se o OCR estiver fora
  do ar e continua validando tamanho e tipo real do arquivo
- Remove o Claude Vision e a dependência @anthropic-ai/sdk
- Front end: aceita PDF e ajusta os textos
- Monografia atualizada
</commit_message>
<xml_diff>
--- a/docs/monografia/Monografia-NotificaVacinas.docx
+++ b/docs/monografia/Monografia-NotificaVacinas.docx
@@ -259,7 +259,7 @@
         <w:t xml:space="preserve"> </w:t>
       </w:r>
       <w:r>
-        <w:t xml:space="preserve">agendado para o envio das notificações. Como diferencial, a carteirinha física pode ser fotografada e seus dados são extraídos por um modelo de visão computacional, sendo sempre submetidos à confirmação do usuário antes de serem gravados. O trabalho descreve o referencial teórico, os requisitos, o projeto, a implementação, as decisões de segurança e de proteção de dados pessoais de saúde (LGPD), as limitações da versão atual e as melhorias futuras, entre as quais a integração com o Meu SUS Digital e com convênios e hospitais para atualização automática da carteira.</w:t>
+        <w:t xml:space="preserve">agendado para o envio das notificações. Como diferencial, a carteirinha física pode ser fotografada e seus dados são extraídos por reconhecimento óptico de caracteres (OCR) com a biblioteca Docling, em um serviço próprio, sendo sempre submetidos à confirmação do usuário antes de serem gravados. O trabalho descreve o referencial teórico, os requisitos, o projeto, a implementação, as decisões de segurança e de proteção de dados pessoais de saúde (LGPD), as limitações da versão atual e as melhorias futuras, entre as quais a integração com o Meu SUS Digital e com convênios e hospitais para atualização automática da carteira.</w:t>
       </w:r>
     </w:p>
     <w:p>
@@ -308,7 +308,7 @@
         <w:t xml:space="preserve">Notifica Vacinas</w:t>
       </w:r>
       <w:r>
-        <w:t xml:space="preserve">, a web system that lets users keep their own vaccination record and that of their dependents, compare it with the vaccination schedule by age group and special group, and receive e-mail notifications about pending doses and upcoming appointments. The system follows a layered client-server architecture: a React front end, a REST API in Node.js with Express and TypeScript, SQLite persistence and a scheduled job for notifications. As a differentiator, the physical vaccination card can be photographed and its data extracted by a computer-vision model, always subject to user confirmation before being saved. The work describes the theoretical background, requirements, design, implementation, security and personal health data protection decisions (LGPD), limitations of the current version and future work, including integration with Meu SUS Digital and with health insurers and hospitals for automatic record updates.</w:t>
+        <w:t xml:space="preserve">, a web system that lets users keep their own vaccination record and that of their dependents, compare it with the vaccination schedule by age group and special group, and receive e-mail notifications about pending doses and upcoming appointments. The system follows a layered client-server architecture: a React front end, a REST API in Node.js with Express and TypeScript, SQLite persistence and a scheduled job for notifications. As a differentiator, the physical vaccination card can be photographed and its data extracted by optical character recognition (OCR) with the Docling library, in a self-hosted service, always subject to user confirmation before being saved. The work describes the theoretical background, requirements, design, implementation, security and personal health data protection decisions (LGPD), limitations of the current version and future work, including integration with Meu SUS Digital and with health insurers and hospitals for automatic record updates.</w:t>
       </w:r>
     </w:p>
     <w:p>
@@ -1230,7 +1230,7 @@
         </w:numPr>
       </w:pPr>
       <w:r>
-        <w:t xml:space="preserve">automatizar o cadastro de doses a partir da fotografia da carteirinha, mantendo o usuário no controle da confirmação;</w:t>
+        <w:t xml:space="preserve">automatizar o cadastro de doses a partir da foto ou do PDF da carteirinha, por OCR, mantendo o usuário no controle da confirmação;</w:t>
       </w:r>
     </w:p>
     <w:p>
@@ -2100,13 +2100,13 @@
       </w:r>
     </w:p>
     <w:bookmarkEnd w:id="45"/>
-    <w:bookmarkStart w:id="46" w:name="X11aab684b091e7418fcd63d60c383df6a94f992"/>
+    <w:bookmarkStart w:id="46" w:name="X62cb89ef7ac08015ad2a06a67185ab94465110c"/>
     <w:p>
       <w:pPr>
         <w:pStyle w:val="Heading2"/>
       </w:pPr>
       <w:r>
-        <w:t xml:space="preserve">2.5 Inteligência artificial de visão para extração de dados</w:t>
+        <w:t xml:space="preserve">2.5 Reconhecimento óptico de caracteres (OCR) e Docling</w:t>
       </w:r>
     </w:p>
     <w:p>
@@ -2114,25 +2114,76 @@
         <w:pStyle w:val="FirstParagraph"/>
       </w:pPr>
       <w:r>
-        <w:t xml:space="preserve">Modelos multimodais de linguagem conseguem receber uma imagem e responder em formato estruturado. Para documentos como carteirinhas, isso elimina a etapa de OCR tradicional seguida de regras de análise textual, pois o modelo interpreta layout, carimbos e escrita manual. Por outro lado, tais modelos podem errar ou</w:t>
-      </w:r>
-      <w:r>
-        <w:t xml:space="preserve"> </w:t>
-      </w:r>
-      <w:r>
-        <w:t xml:space="preserve">“</w:t>
-      </w:r>
-      <w:r>
-        <w:t xml:space="preserve">alucinar</w:t>
-      </w:r>
-      <w:r>
-        <w:t xml:space="preserve">”</w:t>
-      </w:r>
-      <w:r>
-        <w:t xml:space="preserve"> </w:t>
-      </w:r>
-      <w:r>
-        <w:t xml:space="preserve">campos ilegíveis. Daí a decisão de projeto, tratada na Seção 5.4, de nunca gravar automaticamente: a IA</w:t>
+        <w:t xml:space="preserve">O reconhecimento óptico de caracteres converte o texto presente em uma imagem em texto digital. O</w:t>
+      </w:r>
+      <w:r>
+        <w:t xml:space="preserve"> </w:t>
+      </w:r>
+      <w:r>
+        <w:rPr>
+          <w:bCs/>
+          <w:b/>
+        </w:rPr>
+        <w:t xml:space="preserve">Docling</w:t>
+      </w:r>
+      <w:r>
+        <w:t xml:space="preserve">, biblioteca de código aberto em Python, vai além do OCR puro: analisa o</w:t>
+      </w:r>
+      <w:r>
+        <w:t xml:space="preserve"> </w:t>
+      </w:r>
+      <w:r>
+        <w:rPr>
+          <w:iCs/>
+          <w:i/>
+        </w:rPr>
+        <w:t xml:space="preserve">layout</w:t>
+      </w:r>
+      <w:r>
+        <w:t xml:space="preserve"> </w:t>
+      </w:r>
+      <w:r>
+        <w:t xml:space="preserve">da página, reconhece tabelas e preserva a estrutura do documento, exportando o resultado em formatos como o Markdown. Isso interessa a uma carteirinha de vacinação, cujo conteúdo é essencialmente uma tabela (vacina, dose, data, lote, unidade).</w:t>
+      </w:r>
+    </w:p>
+    <w:p>
+      <w:pPr>
+        <w:pStyle w:val="BodyText"/>
+      </w:pPr>
+      <w:r>
+        <w:t xml:space="preserve">A abordagem escolhida separa duas responsabilidades: o</w:t>
+      </w:r>
+      <w:r>
+        <w:t xml:space="preserve"> </w:t>
+      </w:r>
+      <w:r>
+        <w:rPr>
+          <w:bCs/>
+          <w:b/>
+        </w:rPr>
+        <w:t xml:space="preserve">OCR</w:t>
+      </w:r>
+      <w:r>
+        <w:t xml:space="preserve"> </w:t>
+      </w:r>
+      <w:r>
+        <w:t xml:space="preserve">(Docling) devolve o texto estruturado, e um</w:t>
+      </w:r>
+      <w:r>
+        <w:t xml:space="preserve"> </w:t>
+      </w:r>
+      <w:r>
+        <w:rPr>
+          <w:bCs/>
+          <w:b/>
+        </w:rPr>
+        <w:t xml:space="preserve">extrator determinístico</w:t>
+      </w:r>
+      <w:r>
+        <w:t xml:space="preserve"> </w:t>
+      </w:r>
+      <w:r>
+        <w:t xml:space="preserve">interpreta esse texto, identificando em cada linha a vacina (por correspondência com o catálogo do sistema, inclusive abreviações), a dose, as datas, o lote e a unidade de saúde. Em comparação com enviar a imagem a um modelo de linguagem de terceiros, a solução roda na infraestrutura do próprio sistema, o que evita compartilhar dados pessoais de saúde com um operador externo (LGPD), não tem custo por imagem e produz resultados reproduzíveis e testáveis. O preço é a menor tolerância a escrita manuscrita e a carimbos borrados: o OCR tradicional lê bem texto impresso ou digital (por exemplo, o PDF da carteira do Meu SUS Digital), mas erra mais com letra de mão. Daí a decisão de projeto, tratada na Seção 5.4, de nunca gravar automaticamente: o sistema</w:t>
       </w:r>
       <w:r>
         <w:t xml:space="preserve"> </w:t>
@@ -2332,7 +2383,7 @@
               <w:jc w:val="left"/>
             </w:pPr>
             <w:r>
-              <w:t xml:space="preserve">Provedor de e-mail (SMTP), serviço de IA de visão e serviço público de consulta de CEP (ViaCEP).</w:t>
+              <w:t xml:space="preserve">Provedor de e-mail (SMTP), serviço próprio de OCR (Docling) e serviço público de consulta de CEP (ViaCEP).</w:t>
             </w:r>
           </w:p>
         </w:tc>
@@ -3213,7 +3264,7 @@
               <w:jc w:val="left"/>
             </w:pPr>
             <w:r>
-              <w:t xml:space="preserve">Falha do provedor de e-mail ou de IA não deve derrubar o servidor.</w:t>
+              <w:t xml:space="preserve">Falha do provedor de e-mail ou do serviço de OCR não deve derrubar o servidor.</w:t>
             </w:r>
           </w:p>
         </w:tc>
@@ -3684,7 +3735,7 @@
         <w:t xml:space="preserve"> </w:t>
       </w:r>
       <w:r>
-        <w:t xml:space="preserve">(1) o usuário seleciona a pessoa e envia a imagem; (2) o sistema valida a posse da pessoa; (3) o sistema envia a imagem ao serviço de visão; (4) o sistema devolve vacina, dose, data, lote e local extraídos; (5) o usuário revisa e corrige os campos; (6) o usuário confirma; (7) o sistema grava o registro e a dose; (8) o sistema envia a confirmação por e-mail, se permitido.</w:t>
+        <w:t xml:space="preserve">(1) o usuário seleciona a pessoa e envia a foto ou o PDF; (2) o sistema valida a posse da pessoa; (3) o sistema envia o arquivo ao serviço de OCR (Docling) e extrai os campos do texto lido; (4) o sistema devolve vacina, dose, data, lote e local extraídos; (5) o usuário revisa e corrige os campos; (6) o usuário confirma; (7) o sistema grava o registro e a dose; (8) o sistema envia a confirmação por e-mail, se permitido.</w:t>
       </w:r>
     </w:p>
     <w:p>
@@ -3706,7 +3757,7 @@
         <w:t xml:space="preserve"> </w:t>
       </w:r>
       <w:r>
-        <w:t xml:space="preserve">a IA retorna erro (imagem ilegível ou não é carteirinha): o sistema informa o motivo e permite novo envio ou o cadastro manual.</w:t>
+        <w:t xml:space="preserve">o OCR não lê texto ou o texto não contém nenhuma vacina conhecida (imagem ilegível ou não é carteirinha): o sistema informa o motivo e permite novo envio ou o cadastro manual.</w:t>
       </w:r>
     </w:p>
     <w:p>
@@ -3957,7 +4008,7 @@
         <w:rPr>
           <w:rStyle w:val="VerbatimChar"/>
         </w:rPr>
-        <w:t xml:space="preserve">                                                                         |  - API de IA de visão      |</w:t>
+        <w:t xml:space="preserve">                                                                         |  - Serviço de OCR (Docling) |</w:t>
       </w:r>
       <w:r>
         <w:br/>
@@ -6323,7 +6374,7 @@
               <w:jc w:val="left"/>
             </w:pPr>
             <w:r>
-              <w:t xml:space="preserve">Envia imagem para a IA.</w:t>
+              <w:t xml:space="preserve">Envia foto ou PDF para leitura por OCR.</w:t>
             </w:r>
           </w:p>
         </w:tc>
@@ -6991,6 +7042,18 @@
               <w:rPr>
                 <w:rStyle w:val="VerbatimChar"/>
               </w:rPr>
+              <w:t xml:space="preserve">helmet</w:t>
+            </w:r>
+            <w:r>
+              <w:t xml:space="preserve">,</w:t>
+            </w:r>
+            <w:r>
+              <w:t xml:space="preserve"> </w:t>
+            </w:r>
+            <w:r>
+              <w:rPr>
+                <w:rStyle w:val="VerbatimChar"/>
+              </w:rPr>
               <w:t xml:space="preserve">express-rate-limit</w:t>
             </w:r>
           </w:p>
@@ -7003,7 +7066,7 @@
               <w:jc w:val="left"/>
             </w:pPr>
             <w:r>
-              <w:t xml:space="preserve">Controle de origem e de abuso.</w:t>
+              <w:t xml:space="preserve">Controle de origem, cabeçalhos de segurança e abuso.</w:t>
             </w:r>
           </w:p>
         </w:tc>
@@ -7070,31 +7133,31 @@
               <w:jc w:val="left"/>
             </w:pPr>
             <w:r>
-              <w:t xml:space="preserve">IA</w:t>
-            </w:r>
-          </w:p>
-        </w:tc>
-        <w:tc>
-          <w:tcPr/>
-          <w:p>
-            <w:pPr>
-              <w:pStyle w:val="Compact"/>
-              <w:jc w:val="left"/>
-            </w:pPr>
-            <w:r>
-              <w:t xml:space="preserve">SDK da Anthropic (modelo com visão)</w:t>
-            </w:r>
-          </w:p>
-        </w:tc>
-        <w:tc>
-          <w:tcPr/>
-          <w:p>
-            <w:pPr>
-              <w:pStyle w:val="Compact"/>
-              <w:jc w:val="left"/>
-            </w:pPr>
-            <w:r>
-              <w:t xml:space="preserve">Extração estruturada de imagens.</w:t>
+              <w:t xml:space="preserve">OCR</w:t>
+            </w:r>
+          </w:p>
+        </w:tc>
+        <w:tc>
+          <w:tcPr/>
+          <w:p>
+            <w:pPr>
+              <w:pStyle w:val="Compact"/>
+              <w:jc w:val="left"/>
+            </w:pPr>
+            <w:r>
+              <w:t xml:space="preserve">Docling (Python), FastAPI</w:t>
+            </w:r>
+          </w:p>
+        </w:tc>
+        <w:tc>
+          <w:tcPr/>
+          <w:p>
+            <w:pPr>
+              <w:pStyle w:val="Compact"/>
+              <w:jc w:val="left"/>
+            </w:pPr>
+            <w:r>
+              <w:t xml:space="preserve">Leitura de texto e tabelas da carteirinha, em serviço próprio.</w:t>
             </w:r>
           </w:p>
         </w:tc>
@@ -7893,42 +7956,13 @@
         <w:rPr>
           <w:rStyle w:val="VerbatimChar"/>
         </w:rPr>
-        <w:t xml:space="preserve">ClaudeVisionService</w:t>
-      </w:r>
-      <w:r>
-        <w:t xml:space="preserve"> </w:t>
-      </w:r>
-      <w:r>
-        <w:t xml:space="preserve">recebe a imagem em</w:t>
-      </w:r>
-      <w:r>
-        <w:t xml:space="preserve"> </w:t>
-      </w:r>
-      <w:r>
-        <w:rPr>
-          <w:iCs/>
-          <w:i/>
-        </w:rPr>
-        <w:t xml:space="preserve">base64</w:t>
-      </w:r>
-      <w:r>
-        <w:t xml:space="preserve">, valida o tipo (JPEG, PNG ou WebP) e a existência da chave de API, e envia ao modelo um</w:t>
-      </w:r>
-      <w:r>
-        <w:t xml:space="preserve"> </w:t>
-      </w:r>
-      <w:r>
-        <w:rPr>
-          <w:iCs/>
-          <w:i/>
-        </w:rPr>
-        <w:t xml:space="preserve">prompt</w:t>
-      </w:r>
-      <w:r>
-        <w:t xml:space="preserve"> </w:t>
-      </w:r>
-      <w:r>
-        <w:t xml:space="preserve">que exige resposta exclusivamente em JSON, com vacina, dose, data de aplicação, lote, local, nome e data de nascimento do titular, ou um objeto de erro quando a imagem não for uma carteirinha. A resposta é validada (JSON legível, campo</w:t>
+        <w:t xml:space="preserve">OcrService</w:t>
+      </w:r>
+      <w:r>
+        <w:t xml:space="preserve"> </w:t>
+      </w:r>
+      <w:r>
+        <w:t xml:space="preserve">envia o arquivo (JPEG, PNG, WebP ou PDF) ao serviço de OCR, um pequeno servidor FastAPI em Python (pasta</w:t>
       </w:r>
       <w:r>
         <w:t xml:space="preserve"> </w:t>
@@ -7937,13 +7971,10 @@
         <w:rPr>
           <w:rStyle w:val="VerbatimChar"/>
         </w:rPr>
-        <w:t xml:space="preserve">vacina</w:t>
-      </w:r>
-      <w:r>
-        <w:t xml:space="preserve"> </w:t>
-      </w:r>
-      <w:r>
-        <w:t xml:space="preserve">presente) e os campos ilegíveis voltam como</w:t>
+        <w:t xml:space="preserve">ocr-service/</w:t>
+      </w:r>
+      <w:r>
+        <w:t xml:space="preserve">) que executa o Docling e devolve o texto em Markdown, tabelas incluídas. Em seguida, o</w:t>
       </w:r>
       <w:r>
         <w:t xml:space="preserve"> </w:t>
@@ -7952,18 +7983,22 @@
         <w:rPr>
           <w:rStyle w:val="VerbatimChar"/>
         </w:rPr>
-        <w:t xml:space="preserve">null</w:t>
-      </w:r>
-      <w:r>
-        <w:t xml:space="preserve">.</w:t>
-      </w:r>
-    </w:p>
-    <w:p>
-      <w:pPr>
-        <w:pStyle w:val="BodyText"/>
-      </w:pPr>
-      <w:r>
-        <w:t xml:space="preserve">Três decisões de projeto merecem destaque:</w:t>
+        <w:t xml:space="preserve">LeituraCarteirinhaService</w:t>
+      </w:r>
+      <w:r>
+        <w:t xml:space="preserve"> </w:t>
+      </w:r>
+      <w:r>
+        <w:t xml:space="preserve">carrega o catálogo de vacinas ativas e entrega o texto ao extrator (</w:t>
+      </w:r>
+      <w:r>
+        <w:rPr>
+          <w:rStyle w:val="VerbatimChar"/>
+        </w:rPr>
+        <w:t xml:space="preserve">utils/extratorCarteirinha.ts</w:t>
+      </w:r>
+      <w:r>
+        <w:t xml:space="preserve">), uma função pura. Para cada linha do texto, o extrator:</w:t>
       </w:r>
     </w:p>
     <w:p>
@@ -7975,44 +8010,70 @@
         <w:pStyle w:val="Compact"/>
       </w:pPr>
       <w:r>
-        <w:rPr>
-          <w:bCs/>
-          <w:b/>
-        </w:rPr>
-        <w:t xml:space="preserve">Humano no circuito.</w:t>
-      </w:r>
-      <w:r>
-        <w:t xml:space="preserve"> </w:t>
-      </w:r>
-      <w:r>
-        <w:t xml:space="preserve">O endpoint</w:t>
-      </w:r>
-      <w:r>
-        <w:t xml:space="preserve"> </w:t>
-      </w:r>
-      <w:r>
-        <w:rPr>
-          <w:rStyle w:val="VerbatimChar"/>
-        </w:rPr>
-        <w:t xml:space="preserve">/scan/analisar</w:t>
-      </w:r>
-      <w:r>
-        <w:t xml:space="preserve"> </w:t>
-      </w:r>
-      <w:r>
-        <w:t xml:space="preserve">apenas devolve a sugestão. A gravação ocorre em</w:t>
-      </w:r>
-      <w:r>
-        <w:t xml:space="preserve"> </w:t>
-      </w:r>
-      <w:r>
-        <w:rPr>
-          <w:rStyle w:val="VerbatimChar"/>
-        </w:rPr>
-        <w:t xml:space="preserve">/carteira/confirmar-scan</w:t>
-      </w:r>
-      <w:r>
-        <w:t xml:space="preserve">, após revisão do usuário. Isso trata o risco de erro do modelo, relevante porque um dado vacinal incorreto pode levar a uma conclusão errada de que a pessoa está protegida.</w:t>
+        <w:t xml:space="preserve">identifica a vacina pelo nome do catálogo ou por apelidos (por exemplo,</w:t>
+      </w:r>
+      <w:r>
+        <w:t xml:space="preserve"> </w:t>
+      </w:r>
+      <w:r>
+        <w:t xml:space="preserve">“</w:t>
+      </w:r>
+      <w:r>
+        <w:t xml:space="preserve">Hep B</w:t>
+      </w:r>
+      <w:r>
+        <w:t xml:space="preserve">”</w:t>
+      </w:r>
+      <w:r>
+        <w:t xml:space="preserve">,</w:t>
+      </w:r>
+      <w:r>
+        <w:t xml:space="preserve"> </w:t>
+      </w:r>
+      <w:r>
+        <w:t xml:space="preserve">“</w:t>
+      </w:r>
+      <w:r>
+        <w:t xml:space="preserve">Pneumo 10</w:t>
+      </w:r>
+      <w:r>
+        <w:t xml:space="preserve">”</w:t>
+      </w:r>
+      <w:r>
+        <w:t xml:space="preserve">,</w:t>
+      </w:r>
+      <w:r>
+        <w:t xml:space="preserve"> </w:t>
+      </w:r>
+      <w:r>
+        <w:t xml:space="preserve">“</w:t>
+      </w:r>
+      <w:r>
+        <w:t xml:space="preserve">SCR</w:t>
+      </w:r>
+      <w:r>
+        <w:t xml:space="preserve">”</w:t>
+      </w:r>
+      <w:r>
+        <w:t xml:space="preserve">), escolhendo o apelido mais longo para não confundir vacinas parecidas (uma linha</w:t>
+      </w:r>
+      <w:r>
+        <w:t xml:space="preserve"> </w:t>
+      </w:r>
+      <w:r>
+        <w:t xml:space="preserve">“</w:t>
+      </w:r>
+      <w:r>
+        <w:t xml:space="preserve">Pentavalente (DTP+Hib+HB)</w:t>
+      </w:r>
+      <w:r>
+        <w:t xml:space="preserve">”</w:t>
+      </w:r>
+      <w:r>
+        <w:t xml:space="preserve"> </w:t>
+      </w:r>
+      <w:r>
+        <w:t xml:space="preserve">é pentavalente, não DTP);</w:t>
       </w:r>
     </w:p>
     <w:p>
@@ -8024,43 +8085,49 @@
         <w:pStyle w:val="Compact"/>
       </w:pPr>
       <w:r>
-        <w:rPr>
-          <w:bCs/>
-          <w:b/>
-        </w:rPr>
-        <w:t xml:space="preserve">Validação do arquivo.</w:t>
-      </w:r>
-      <w:r>
-        <w:t xml:space="preserve"> </w:t>
-      </w:r>
-      <w:r>
-        <w:t xml:space="preserve">O corpo aceita até 10 MB (a imagem trafega em</w:t>
-      </w:r>
-      <w:r>
-        <w:t xml:space="preserve"> </w:t>
-      </w:r>
-      <w:r>
-        <w:rPr>
-          <w:iCs/>
-          <w:i/>
-        </w:rPr>
-        <w:t xml:space="preserve">base64</w:t>
-      </w:r>
-      <w:r>
-        <w:t xml:space="preserve">), mas a imagem decodificada é limitada a 5 MB e seu tipo é deduzido dos primeiros bytes (</w:t>
-      </w:r>
-      <w:r>
-        <w:rPr>
-          <w:iCs/>
-          <w:i/>
-        </w:rPr>
-        <w:t xml:space="preserve">magic bytes</w:t>
-      </w:r>
-      <w:r>
-        <w:t xml:space="preserve"> </w:t>
-      </w:r>
-      <w:r>
-        <w:t xml:space="preserve">de JPEG, PNG e WEBP), e não do</w:t>
+        <w:t xml:space="preserve">lê a dose (</w:t>
+      </w:r>
+      <w:r>
+        <w:t xml:space="preserve">“</w:t>
+      </w:r>
+      <w:r>
+        <w:t xml:space="preserve">1ª dose</w:t>
+      </w:r>
+      <w:r>
+        <w:t xml:space="preserve">”</w:t>
+      </w:r>
+      <w:r>
+        <w:t xml:space="preserve">,</w:t>
+      </w:r>
+      <w:r>
+        <w:t xml:space="preserve"> </w:t>
+      </w:r>
+      <w:r>
+        <w:t xml:space="preserve">“</w:t>
+      </w:r>
+      <w:r>
+        <w:t xml:space="preserve">Dose única</w:t>
+      </w:r>
+      <w:r>
+        <w:t xml:space="preserve">”</w:t>
+      </w:r>
+      <w:r>
+        <w:t xml:space="preserve">,</w:t>
+      </w:r>
+      <w:r>
+        <w:t xml:space="preserve"> </w:t>
+      </w:r>
+      <w:r>
+        <w:t xml:space="preserve">“</w:t>
+      </w:r>
+      <w:r>
+        <w:t xml:space="preserve">Reforço</w:t>
+      </w:r>
+      <w:r>
+        <w:t xml:space="preserve">”</w:t>
+      </w:r>
+      <w:r>
+        <w:t xml:space="preserve">), as datas (formatos</w:t>
       </w:r>
       <w:r>
         <w:t xml:space="preserve"> </w:t>
@@ -8069,13 +8136,37 @@
         <w:rPr>
           <w:rStyle w:val="VerbatimChar"/>
         </w:rPr>
-        <w:t xml:space="preserve">mediaType</w:t>
-      </w:r>
-      <w:r>
-        <w:t xml:space="preserve"> </w:t>
-      </w:r>
-      <w:r>
-        <w:t xml:space="preserve">informado pelo cliente. A rota tem limite de chamadas por usuário, porque cada análise gera custo no serviço de IA.</w:t>
+        <w:t xml:space="preserve">dd/mm/aaaa</w:t>
+      </w:r>
+      <w:r>
+        <w:t xml:space="preserve">,</w:t>
+      </w:r>
+      <w:r>
+        <w:t xml:space="preserve"> </w:t>
+      </w:r>
+      <w:r>
+        <w:rPr>
+          <w:rStyle w:val="VerbatimChar"/>
+        </w:rPr>
+        <w:t xml:space="preserve">dd-mm-aa</w:t>
+      </w:r>
+      <w:r>
+        <w:t xml:space="preserve"> </w:t>
+      </w:r>
+      <w:r>
+        <w:t xml:space="preserve">e</w:t>
+      </w:r>
+      <w:r>
+        <w:t xml:space="preserve"> </w:t>
+      </w:r>
+      <w:r>
+        <w:rPr>
+          <w:rStyle w:val="VerbatimChar"/>
+        </w:rPr>
+        <w:t xml:space="preserve">aaaa-mm-dd</w:t>
+      </w:r>
+      <w:r>
+        <w:t xml:space="preserve">, descartando datas impossíveis), o lote e a unidade de saúde;</w:t>
       </w:r>
     </w:p>
     <w:p>
@@ -8087,10 +8178,181 @@
         <w:pStyle w:val="Compact"/>
       </w:pPr>
       <w:r>
+        <w:t xml:space="preserve">trata datas futuras como</w:t>
+      </w:r>
+      <w:r>
+        <w:t xml:space="preserve"> </w:t>
+      </w:r>
+      <w:r>
+        <w:t xml:space="preserve">“</w:t>
+      </w:r>
+      <w:r>
+        <w:t xml:space="preserve">próxima dose</w:t>
+      </w:r>
+      <w:r>
+        <w:t xml:space="preserve">”</w:t>
+      </w:r>
+      <w:r>
+        <w:t xml:space="preserve">, e não como aplicação, e ignora a data de nascimento do titular;</w:t>
+      </w:r>
+    </w:p>
+    <w:p>
+      <w:pPr>
+        <w:numPr>
+          <w:ilvl w:val="0"/>
+          <w:numId w:val="1003"/>
+        </w:numPr>
+        <w:pStyle w:val="Compact"/>
+      </w:pPr>
+      <w:r>
+        <w:t xml:space="preserve">devolve o registro mais recente, além do nome e da data de nascimento do titular, quando presentes. Campos não encontrados voltam como</w:t>
+      </w:r>
+      <w:r>
+        <w:t xml:space="preserve"> </w:t>
+      </w:r>
+      <w:r>
+        <w:rPr>
+          <w:rStyle w:val="VerbatimChar"/>
+        </w:rPr>
+        <w:t xml:space="preserve">null</w:t>
+      </w:r>
+      <w:r>
+        <w:t xml:space="preserve">.</w:t>
+      </w:r>
+    </w:p>
+    <w:p>
+      <w:pPr>
+        <w:pStyle w:val="FirstParagraph"/>
+      </w:pPr>
+      <w:r>
+        <w:t xml:space="preserve">Quatro decisões de projeto merecem destaque:</w:t>
+      </w:r>
+    </w:p>
+    <w:p>
+      <w:pPr>
+        <w:numPr>
+          <w:ilvl w:val="0"/>
+          <w:numId w:val="1004"/>
+        </w:numPr>
+        <w:pStyle w:val="Compact"/>
+      </w:pPr>
+      <w:r>
         <w:rPr>
           <w:bCs/>
           <w:b/>
         </w:rPr>
+        <w:t xml:space="preserve">Humano no circuito.</w:t>
+      </w:r>
+      <w:r>
+        <w:t xml:space="preserve"> </w:t>
+      </w:r>
+      <w:r>
+        <w:t xml:space="preserve">O endpoint</w:t>
+      </w:r>
+      <w:r>
+        <w:t xml:space="preserve"> </w:t>
+      </w:r>
+      <w:r>
+        <w:rPr>
+          <w:rStyle w:val="VerbatimChar"/>
+        </w:rPr>
+        <w:t xml:space="preserve">/scan/analisar</w:t>
+      </w:r>
+      <w:r>
+        <w:t xml:space="preserve"> </w:t>
+      </w:r>
+      <w:r>
+        <w:t xml:space="preserve">apenas devolve a sugestão. A gravação ocorre em</w:t>
+      </w:r>
+      <w:r>
+        <w:t xml:space="preserve"> </w:t>
+      </w:r>
+      <w:r>
+        <w:rPr>
+          <w:rStyle w:val="VerbatimChar"/>
+        </w:rPr>
+        <w:t xml:space="preserve">/carteira/confirmar-scan</w:t>
+      </w:r>
+      <w:r>
+        <w:t xml:space="preserve">, após revisão do usuário. Isso trata o risco de erro de leitura (OCR em letra manuscrita, por exemplo), relevante porque um dado vacinal incorreto pode levar a uma conclusão errada de que a pessoa está protegida.</w:t>
+      </w:r>
+    </w:p>
+    <w:p>
+      <w:pPr>
+        <w:numPr>
+          <w:ilvl w:val="0"/>
+          <w:numId w:val="1004"/>
+        </w:numPr>
+        <w:pStyle w:val="Compact"/>
+      </w:pPr>
+      <w:r>
+        <w:rPr>
+          <w:bCs/>
+          <w:b/>
+        </w:rPr>
+        <w:t xml:space="preserve">Validação do arquivo.</w:t>
+      </w:r>
+      <w:r>
+        <w:t xml:space="preserve"> </w:t>
+      </w:r>
+      <w:r>
+        <w:t xml:space="preserve">O corpo aceita até 10 MB (a imagem trafega em</w:t>
+      </w:r>
+      <w:r>
+        <w:t xml:space="preserve"> </w:t>
+      </w:r>
+      <w:r>
+        <w:rPr>
+          <w:iCs/>
+          <w:i/>
+        </w:rPr>
+        <w:t xml:space="preserve">base64</w:t>
+      </w:r>
+      <w:r>
+        <w:t xml:space="preserve">), mas a imagem decodificada é limitada a 5 MB e seu tipo é deduzido dos primeiros bytes (</w:t>
+      </w:r>
+      <w:r>
+        <w:rPr>
+          <w:iCs/>
+          <w:i/>
+        </w:rPr>
+        <w:t xml:space="preserve">magic bytes</w:t>
+      </w:r>
+      <w:r>
+        <w:t xml:space="preserve"> </w:t>
+      </w:r>
+      <w:r>
+        <w:t xml:space="preserve">de JPEG, PNG e WEBP), e não do</w:t>
+      </w:r>
+      <w:r>
+        <w:t xml:space="preserve"> </w:t>
+      </w:r>
+      <w:r>
+        <w:rPr>
+          <w:rStyle w:val="VerbatimChar"/>
+        </w:rPr>
+        <w:t xml:space="preserve">mediaType</w:t>
+      </w:r>
+      <w:r>
+        <w:t xml:space="preserve"> </w:t>
+      </w:r>
+      <w:r>
+        <w:t xml:space="preserve">informado pelo cliente. A rota tem limite de chamadas por usuário, porque cada análise consome processamento do serviço de OCR.</w:t>
+      </w:r>
+    </w:p>
+    <w:p>
+      <w:pPr>
+        <w:numPr>
+          <w:ilvl w:val="0"/>
+          <w:numId w:val="1004"/>
+        </w:numPr>
+        <w:pStyle w:val="Compact"/>
+      </w:pPr>
+      <w:r>
+        <w:rPr>
+          <w:bCs/>
+          <w:b/>
+        </w:rPr>
         <w:t xml:space="preserve">Cadastro automático de dependente</w:t>
       </w:r>
       <w:r>
@@ -8098,6 +8360,43 @@
       </w:r>
       <w:r>
         <w:t xml:space="preserve">quando a carteirinha pertence a outra pessoa, usando nome e data de nascimento extraídos, também sujeito à confirmação.</w:t>
+      </w:r>
+    </w:p>
+    <w:p>
+      <w:pPr>
+        <w:numPr>
+          <w:ilvl w:val="0"/>
+          <w:numId w:val="1004"/>
+        </w:numPr>
+        <w:pStyle w:val="Compact"/>
+      </w:pPr>
+      <w:r>
+        <w:rPr>
+          <w:bCs/>
+          <w:b/>
+        </w:rPr>
+        <w:t xml:space="preserve">Isolamento do OCR.</w:t>
+      </w:r>
+      <w:r>
+        <w:t xml:space="preserve"> </w:t>
+      </w:r>
+      <w:r>
+        <w:t xml:space="preserve">O serviço de OCR é um processo separado, chamado por HTTP com tempo limite. Se estiver fora do ar, o</w:t>
+      </w:r>
+      <w:r>
+        <w:t xml:space="preserve"> </w:t>
+      </w:r>
+      <w:r>
+        <w:rPr>
+          <w:rStyle w:val="VerbatimChar"/>
+        </w:rPr>
+        <w:t xml:space="preserve">/scan/analisar</w:t>
+      </w:r>
+      <w:r>
+        <w:t xml:space="preserve"> </w:t>
+      </w:r>
+      <w:r>
+        <w:t xml:space="preserve">responde 503 com mensagem clara e o usuário cadastra a dose manualmente, sem derrubar o servidor principal (RNF09). Como o serviço recebe dados pessoais de saúde e não tem autenticação própria, deve ficar em rede interna, acessível só pelo back end.</w:t>
       </w:r>
     </w:p>
     <w:bookmarkEnd w:id="65"/>
@@ -9209,7 +9508,7 @@
         <w:t xml:space="preserve"> </w:t>
       </w:r>
       <w:r>
-        <w:t xml:space="preserve">de dados a pedido do titular (art. 18); (c) registro de operações de tratamento; (d) criptografia do banco em repouso; e (e) análise do envio de imagens a um serviço externo de IA, que constitui compartilhamento com operador, possivelmente com transferência internacional (arts. 33 a 36), exigindo contrato, base legal e transparência ao titular. Recomenda-se também elaborar um Relatório de Impacto à Proteção de Dados Pessoais (RIPD).</w:t>
+        <w:t xml:space="preserve">de dados a pedido do titular (art. 18); (c) registro de operações de tratamento; (d) criptografia do banco em repouso; e (e) definição de que o serviço de OCR permanece em rede interna, sem acesso externo e sem guardar os arquivos recebidos (o OCR é feito em arquivo temporário apagado ao fim do pedido), de modo que as imagens da carteirinha não são compartilhadas com terceiros nem transferidas para fora da infraestrutura do sistema, o que dispensa, nesse ponto, contrato com operador e análise de transferência internacional (arts. 33 a 36). Recomenda-se também elaborar um Relatório de Impacto à Proteção de Dados Pessoais (RIPD).</w:t>
       </w:r>
     </w:p>
     <w:bookmarkEnd w:id="70"/>
@@ -9234,7 +9533,7 @@
       <w:pPr>
         <w:numPr>
           <w:ilvl w:val="0"/>
-          <w:numId w:val="1004"/>
+          <w:numId w:val="1005"/>
         </w:numPr>
         <w:pStyle w:val="Compact"/>
       </w:pPr>
@@ -9256,7 +9555,7 @@
       <w:pPr>
         <w:numPr>
           <w:ilvl w:val="0"/>
-          <w:numId w:val="1004"/>
+          <w:numId w:val="1005"/>
         </w:numPr>
         <w:pStyle w:val="Compact"/>
       </w:pPr>
@@ -9271,7 +9570,7 @@
         <w:t xml:space="preserve"> </w:t>
       </w:r>
       <w:r>
-        <w:t xml:space="preserve">erros de SMTP ou de IA geram mensagens de erro tratadas, e a rotina diária isola as falhas em</w:t>
+        <w:t xml:space="preserve">erros de SMTP ou do serviço de OCR geram mensagens de erro tratadas, e a rotina diária isola as falhas em</w:t>
       </w:r>
       <w:r>
         <w:t xml:space="preserve"> </w:t>
@@ -9290,7 +9589,7 @@
       <w:pPr>
         <w:numPr>
           <w:ilvl w:val="0"/>
-          <w:numId w:val="1004"/>
+          <w:numId w:val="1005"/>
         </w:numPr>
         <w:pStyle w:val="Compact"/>
       </w:pPr>
@@ -9376,7 +9675,7 @@
       <w:pPr>
         <w:numPr>
           <w:ilvl w:val="0"/>
-          <w:numId w:val="1004"/>
+          <w:numId w:val="1005"/>
         </w:numPr>
         <w:pStyle w:val="Compact"/>
       </w:pPr>
@@ -9414,7 +9713,7 @@
       <w:pPr>
         <w:numPr>
           <w:ilvl w:val="0"/>
-          <w:numId w:val="1004"/>
+          <w:numId w:val="1005"/>
         </w:numPr>
         <w:pStyle w:val="Compact"/>
       </w:pPr>
@@ -9436,7 +9735,7 @@
       <w:pPr>
         <w:numPr>
           <w:ilvl w:val="0"/>
-          <w:numId w:val="1004"/>
+          <w:numId w:val="1005"/>
         </w:numPr>
         <w:pStyle w:val="Compact"/>
       </w:pPr>
@@ -9952,7 +10251,7 @@
       <w:pPr>
         <w:numPr>
           <w:ilvl w:val="0"/>
-          <w:numId w:val="1005"/>
+          <w:numId w:val="1006"/>
         </w:numPr>
         <w:pStyle w:val="Compact"/>
       </w:pPr>
@@ -9968,304 +10267,6 @@
       </w:r>
       <w:r>
         <w:t xml:space="preserve">A confiabilidade da carteira depende do que o usuário lança. Não há validação cruzada com o SI-PNI.</w:t>
-      </w:r>
-    </w:p>
-    <w:p>
-      <w:pPr>
-        <w:numPr>
-          <w:ilvl w:val="0"/>
-          <w:numId w:val="1005"/>
-        </w:numPr>
-        <w:pStyle w:val="Compact"/>
-      </w:pPr>
-      <w:r>
-        <w:rPr>
-          <w:bCs/>
-          <w:b/>
-        </w:rPr>
-        <w:t xml:space="preserve">Calendário simplificado.</w:t>
-      </w:r>
-      <w:r>
-        <w:t xml:space="preserve"> </w:t>
-      </w:r>
-      <w:r>
-        <w:t xml:space="preserve">As pendências são calculadas por faixa etária e número de doses. Não consideram ainda</w:t>
-      </w:r>
-      <w:r>
-        <w:t xml:space="preserve"> </w:t>
-      </w:r>
-      <w:r>
-        <w:rPr>
-          <w:bCs/>
-          <w:b/>
-        </w:rPr>
-        <w:t xml:space="preserve">intervalos mínimos entre doses</w:t>
-      </w:r>
-      <w:r>
-        <w:t xml:space="preserve">, idade mínima de cada dose, esquemas de recuperação, contraindicações, nem calendário específico completo por grupo especial. Por exemplo, uma criança de 5 anos e uma de 6 meses pertencem à mesma faixa</w:t>
-      </w:r>
-      <w:r>
-        <w:t xml:space="preserve"> </w:t>
-      </w:r>
-      <w:r>
-        <w:t xml:space="preserve">“</w:t>
-      </w:r>
-      <w:r>
-        <w:t xml:space="preserve">criança</w:t>
-      </w:r>
-      <w:r>
-        <w:t xml:space="preserve">”</w:t>
-      </w:r>
-      <w:r>
-        <w:t xml:space="preserve">.</w:t>
-      </w:r>
-    </w:p>
-    <w:p>
-      <w:pPr>
-        <w:numPr>
-          <w:ilvl w:val="0"/>
-          <w:numId w:val="1005"/>
-        </w:numPr>
-        <w:pStyle w:val="Compact"/>
-      </w:pPr>
-      <w:r>
-        <w:rPr>
-          <w:bCs/>
-          <w:b/>
-        </w:rPr>
-        <w:t xml:space="preserve">Cobertura de testes parcial.</w:t>
-      </w:r>
-      <w:r>
-        <w:t xml:space="preserve"> </w:t>
-      </w:r>
-      <w:r>
-        <w:t xml:space="preserve">Os mecanismos de autenticação e sessão têm testes automatizados, mas o cálculo de pendências, a faixa etária e o</w:t>
-      </w:r>
-      <w:r>
-        <w:t xml:space="preserve"> </w:t>
-      </w:r>
-      <w:r>
-        <w:rPr>
-          <w:iCs/>
-          <w:i/>
-        </w:rPr>
-        <w:t xml:space="preserve">front end</w:t>
-      </w:r>
-      <w:r>
-        <w:t xml:space="preserve"> </w:t>
-      </w:r>
-      <w:r>
-        <w:t xml:space="preserve">ainda não, e não há integração contínua executando-os.</w:t>
-      </w:r>
-    </w:p>
-    <w:p>
-      <w:pPr>
-        <w:numPr>
-          <w:ilvl w:val="0"/>
-          <w:numId w:val="1005"/>
-        </w:numPr>
-        <w:pStyle w:val="Compact"/>
-      </w:pPr>
-      <w:r>
-        <w:rPr>
-          <w:bCs/>
-          <w:b/>
-        </w:rPr>
-        <w:t xml:space="preserve">Banco embarcado e agendador no mesmo processo</w:t>
-      </w:r>
-      <w:r>
-        <w:t xml:space="preserve"> </w:t>
-      </w:r>
-      <w:r>
-        <w:t xml:space="preserve">(Seção 6.3).</w:t>
-      </w:r>
-    </w:p>
-    <w:p>
-      <w:pPr>
-        <w:numPr>
-          <w:ilvl w:val="0"/>
-          <w:numId w:val="1005"/>
-        </w:numPr>
-        <w:pStyle w:val="Compact"/>
-      </w:pPr>
-      <w:r>
-        <w:rPr>
-          <w:bCs/>
-          <w:b/>
-        </w:rPr>
-        <w:t xml:space="preserve">Canal único de notificação e ausência de segundo fator.</w:t>
-      </w:r>
-      <w:r>
-        <w:t xml:space="preserve"> </w:t>
-      </w:r>
-      <w:r>
-        <w:t xml:space="preserve">SMS não foi implementado, e e-mails podem cair em</w:t>
-      </w:r>
-      <w:r>
-        <w:t xml:space="preserve"> </w:t>
-      </w:r>
-      <w:r>
-        <w:rPr>
-          <w:iCs/>
-          <w:i/>
-        </w:rPr>
-        <w:t xml:space="preserve">spam</w:t>
-      </w:r>
-      <w:r>
-        <w:t xml:space="preserve"> </w:t>
-      </w:r>
-      <w:r>
-        <w:t xml:space="preserve">ou não ser lidos. O login depende apenas de e-mail e senha; autenticação em dois fatores (TOTP) permanece como melhoria futura, e deveria ser obrigatória para administradores.</w:t>
-      </w:r>
-    </w:p>
-    <w:p>
-      <w:pPr>
-        <w:numPr>
-          <w:ilvl w:val="0"/>
-          <w:numId w:val="1005"/>
-        </w:numPr>
-        <w:pStyle w:val="Compact"/>
-      </w:pPr>
-      <w:r>
-        <w:rPr>
-          <w:bCs/>
-          <w:b/>
-        </w:rPr>
-        <w:t xml:space="preserve">Conformidade com a LGPD incompleta</w:t>
-      </w:r>
-      <w:r>
-        <w:t xml:space="preserve"> </w:t>
-      </w:r>
-      <w:r>
-        <w:t xml:space="preserve">(Seção 6.2).</w:t>
-      </w:r>
-    </w:p>
-    <w:p>
-      <w:pPr>
-        <w:numPr>
-          <w:ilvl w:val="0"/>
-          <w:numId w:val="1005"/>
-        </w:numPr>
-        <w:pStyle w:val="Compact"/>
-      </w:pPr>
-      <w:r>
-        <w:rPr>
-          <w:bCs/>
-          <w:b/>
-        </w:rPr>
-        <w:t xml:space="preserve">Dependência de serviço externo de IA</w:t>
-      </w:r>
-      <w:r>
-        <w:t xml:space="preserve">, com custo por imagem e necessidade de rede.</w:t>
-      </w:r>
-    </w:p>
-    <w:p>
-      <w:pPr>
-        <w:numPr>
-          <w:ilvl w:val="0"/>
-          <w:numId w:val="1005"/>
-        </w:numPr>
-        <w:pStyle w:val="Compact"/>
-      </w:pPr>
-      <w:r>
-        <w:rPr>
-          <w:bCs/>
-          <w:b/>
-        </w:rPr>
-        <w:t xml:space="preserve">Escrita manual de tabelas SQL</w:t>
-      </w:r>
-      <w:r>
-        <w:t xml:space="preserve"> </w:t>
-      </w:r>
-      <w:r>
-        <w:t xml:space="preserve">e migrações por</w:t>
-      </w:r>
-      <w:r>
-        <w:t xml:space="preserve"> </w:t>
-      </w:r>
-      <w:r>
-        <w:rPr>
-          <w:rStyle w:val="VerbatimChar"/>
-        </w:rPr>
-        <w:t xml:space="preserve">ALTER TABLE</w:t>
-      </w:r>
-      <w:r>
-        <w:t xml:space="preserve"> </w:t>
-      </w:r>
-      <w:r>
-        <w:t xml:space="preserve">com tratamento de erro, em vez de ferramenta de migração versionada. O esquema Prisma no repositório está incompleto em relação às tabelas reais, o que gera inconsistência de manutenção.</w:t>
-      </w:r>
-    </w:p>
-    <w:p>
-      <w:pPr>
-        <w:numPr>
-          <w:ilvl w:val="0"/>
-          <w:numId w:val="1005"/>
-        </w:numPr>
-        <w:pStyle w:val="Compact"/>
-      </w:pPr>
-      <w:r>
-        <w:rPr>
-          <w:bCs/>
-          <w:b/>
-        </w:rPr>
-        <w:t xml:space="preserve">Ausência de avaliação com usuários.</w:t>
-      </w:r>
-      <w:r>
-        <w:t xml:space="preserve"> </w:t>
-      </w:r>
-      <w:r>
-        <w:t xml:space="preserve">Não houve teste de usabilidade com público-alvo, em especial idosos e pessoas de baixa familiaridade digital.</w:t>
-      </w:r>
-    </w:p>
-    <w:bookmarkEnd w:id="75"/>
-    <w:bookmarkEnd w:id="76"/>
-    <w:bookmarkStart w:id="82" w:name="melhorias-futuras"/>
-    <w:p>
-      <w:pPr>
-        <w:pStyle w:val="Heading1"/>
-      </w:pPr>
-      <w:r>
-        <w:t xml:space="preserve">8 MELHORIAS FUTURAS</w:t>
-      </w:r>
-    </w:p>
-    <w:bookmarkStart w:id="77" w:name="integração-com-o-meu-sus-digital-gov.br"/>
-    <w:p>
-      <w:pPr>
-        <w:pStyle w:val="Heading2"/>
-      </w:pPr>
-      <w:r>
-        <w:t xml:space="preserve">8.1 Integração com o Meu SUS Digital (gov.br)</w:t>
-      </w:r>
-    </w:p>
-    <w:p>
-      <w:pPr>
-        <w:pStyle w:val="FirstParagraph"/>
-      </w:pPr>
-      <w:r>
-        <w:rPr>
-          <w:bCs/>
-          <w:b/>
-        </w:rPr>
-        <w:t xml:space="preserve">Objetivo:</w:t>
-      </w:r>
-      <w:r>
-        <w:t xml:space="preserve"> </w:t>
-      </w:r>
-      <w:r>
-        <w:t xml:space="preserve">buscar e atualizar automaticamente a carteira vacinal oficial do cidadão, eliminando a digitação.</w:t>
-      </w:r>
-    </w:p>
-    <w:p>
-      <w:pPr>
-        <w:pStyle w:val="BodyText"/>
-      </w:pPr>
-      <w:r>
-        <w:rPr>
-          <w:bCs/>
-          <w:b/>
-        </w:rPr>
-        <w:t xml:space="preserve">Proposta técnica:</w:t>
       </w:r>
     </w:p>
     <w:p>
@@ -10281,13 +10282,13 @@
           <w:bCs/>
           <w:b/>
         </w:rPr>
-        <w:t xml:space="preserve">Identidade federada.</w:t>
-      </w:r>
-      <w:r>
-        <w:t xml:space="preserve"> </w:t>
-      </w:r>
-      <w:r>
-        <w:t xml:space="preserve">Adotar o login único</w:t>
+        <w:t xml:space="preserve">Calendário simplificado.</w:t>
+      </w:r>
+      <w:r>
+        <w:t xml:space="preserve"> </w:t>
+      </w:r>
+      <w:r>
+        <w:t xml:space="preserve">As pendências são calculadas por faixa etária e número de doses. Não consideram ainda</w:t>
       </w:r>
       <w:r>
         <w:t xml:space="preserve"> </w:t>
@@ -10297,13 +10298,25 @@
           <w:bCs/>
           <w:b/>
         </w:rPr>
-        <w:t xml:space="preserve">gov.br</w:t>
-      </w:r>
-      <w:r>
-        <w:t xml:space="preserve"> </w:t>
-      </w:r>
-      <w:r>
-        <w:t xml:space="preserve">(OAuth 2.0 / OpenID Connect) como método de autenticação, com nível de confiabilidade prata ou ouro, substituindo ou complementando o cadastro por e-mail e senha. O CPF validado passa a ser chave de identificação.</w:t>
+        <w:t xml:space="preserve">intervalos mínimos entre doses</w:t>
+      </w:r>
+      <w:r>
+        <w:t xml:space="preserve">, idade mínima de cada dose, esquemas de recuperação, contraindicações, nem calendário específico completo por grupo especial. Por exemplo, uma criança de 5 anos e uma de 6 meses pertencem à mesma faixa</w:t>
+      </w:r>
+      <w:r>
+        <w:t xml:space="preserve"> </w:t>
+      </w:r>
+      <w:r>
+        <w:t xml:space="preserve">“</w:t>
+      </w:r>
+      <w:r>
+        <w:t xml:space="preserve">criança</w:t>
+      </w:r>
+      <w:r>
+        <w:t xml:space="preserve">”</w:t>
+      </w:r>
+      <w:r>
+        <w:t xml:space="preserve">.</w:t>
       </w:r>
     </w:p>
     <w:p>
@@ -10319,13 +10332,29 @@
           <w:bCs/>
           <w:b/>
         </w:rPr>
-        <w:t xml:space="preserve">Consentimento explícito.</w:t>
-      </w:r>
-      <w:r>
-        <w:t xml:space="preserve"> </w:t>
-      </w:r>
-      <w:r>
-        <w:t xml:space="preserve">Tela que informe quais dados serão lidos, para qual finalidade e por quanto tempo, com possibilidade de revogação (LGPD, arts. 7º, 8º e 11).</w:t>
+        <w:t xml:space="preserve">Cobertura de testes parcial.</w:t>
+      </w:r>
+      <w:r>
+        <w:t xml:space="preserve"> </w:t>
+      </w:r>
+      <w:r>
+        <w:t xml:space="preserve">Os mecanismos de autenticação e sessão têm testes automatizados, mas o cálculo de pendências, a faixa etária e o</w:t>
+      </w:r>
+      <w:r>
+        <w:t xml:space="preserve"> </w:t>
+      </w:r>
+      <w:r>
+        <w:rPr>
+          <w:iCs/>
+          <w:i/>
+        </w:rPr>
+        <w:t xml:space="preserve">front end</w:t>
+      </w:r>
+      <w:r>
+        <w:t xml:space="preserve"> </w:t>
+      </w:r>
+      <w:r>
+        <w:t xml:space="preserve">ainda não, e não há integração contínua executando-os.</w:t>
       </w:r>
     </w:p>
     <w:p>
@@ -10341,41 +10370,13 @@
           <w:bCs/>
           <w:b/>
         </w:rPr>
-        <w:t xml:space="preserve">Consumo da RNDS.</w:t>
-      </w:r>
-      <w:r>
-        <w:t xml:space="preserve"> </w:t>
-      </w:r>
-      <w:r>
-        <w:t xml:space="preserve">Credenciar o sistema junto ao Ministério da Saúde como solução integradora e consumir o histórico de imunização em formato</w:t>
-      </w:r>
-      <w:r>
-        <w:t xml:space="preserve"> </w:t>
-      </w:r>
-      <w:r>
-        <w:rPr>
-          <w:bCs/>
-          <w:b/>
-        </w:rPr>
-        <w:t xml:space="preserve">HL7 FHIR</w:t>
-      </w:r>
-      <w:r>
-        <w:t xml:space="preserve"> </w:t>
-      </w:r>
-      <w:r>
-        <w:t xml:space="preserve">(recurso</w:t>
-      </w:r>
-      <w:r>
-        <w:t xml:space="preserve"> </w:t>
-      </w:r>
-      <w:r>
-        <w:rPr>
-          <w:rStyle w:val="VerbatimChar"/>
-        </w:rPr>
-        <w:t xml:space="preserve">Immunization</w:t>
-      </w:r>
-      <w:r>
-        <w:t xml:space="preserve">), mapeando os códigos de imunobiológico do SI-PNI para o catálogo local de vacinas. O mapeamento deve ser tabelado e versionado.</w:t>
+        <w:t xml:space="preserve">Banco embarcado e agendador no mesmo processo</w:t>
+      </w:r>
+      <w:r>
+        <w:t xml:space="preserve"> </w:t>
+      </w:r>
+      <w:r>
+        <w:t xml:space="preserve">(Seção 6.3).</w:t>
       </w:r>
     </w:p>
     <w:p>
@@ -10391,13 +10392,13 @@
           <w:bCs/>
           <w:b/>
         </w:rPr>
-        <w:t xml:space="preserve">Sincronização.</w:t>
-      </w:r>
-      <w:r>
-        <w:t xml:space="preserve"> </w:t>
-      </w:r>
-      <w:r>
-        <w:t xml:space="preserve">Um</w:t>
+        <w:t xml:space="preserve">Canal único de notificação e ausência de segundo fator.</w:t>
+      </w:r>
+      <w:r>
+        <w:t xml:space="preserve"> </w:t>
+      </w:r>
+      <w:r>
+        <w:t xml:space="preserve">SMS não foi implementado, e e-mails podem cair em</w:t>
       </w:r>
       <w:r>
         <w:t xml:space="preserve"> </w:t>
@@ -10407,94 +10408,13 @@
           <w:iCs/>
           <w:i/>
         </w:rPr>
-        <w:t xml:space="preserve">worker</w:t>
-      </w:r>
-      <w:r>
-        <w:t xml:space="preserve"> </w:t>
-      </w:r>
-      <w:r>
-        <w:t xml:space="preserve">assíncrono consulta periodicamente a RNDS, com política de</w:t>
-      </w:r>
-      <w:r>
-        <w:t xml:space="preserve"> </w:t>
-      </w:r>
-      <w:r>
-        <w:rPr>
-          <w:iCs/>
-          <w:i/>
-        </w:rPr>
-        <w:t xml:space="preserve">retry</w:t>
-      </w:r>
-      <w:r>
-        <w:t xml:space="preserve"> </w:t>
-      </w:r>
-      <w:r>
-        <w:t xml:space="preserve">e</w:t>
-      </w:r>
-      <w:r>
-        <w:t xml:space="preserve"> </w:t>
-      </w:r>
-      <w:r>
-        <w:rPr>
-          <w:iCs/>
-          <w:i/>
-        </w:rPr>
-        <w:t xml:space="preserve">backoff</w:t>
-      </w:r>
-      <w:r>
-        <w:t xml:space="preserve"> </w:t>
-      </w:r>
-      <w:r>
-        <w:t xml:space="preserve">exponencial. A carteira local passa a ter um campo</w:t>
-      </w:r>
-      <w:r>
-        <w:t xml:space="preserve"> </w:t>
-      </w:r>
-      <w:r>
-        <w:rPr>
-          <w:bCs/>
-          <w:b/>
-        </w:rPr>
-        <w:t xml:space="preserve">origem</w:t>
-      </w:r>
-      <w:r>
-        <w:t xml:space="preserve"> </w:t>
-      </w:r>
-      <w:r>
-        <w:t xml:space="preserve">(</w:t>
-      </w:r>
-      <w:r>
-        <w:rPr>
-          <w:rStyle w:val="VerbatimChar"/>
-        </w:rPr>
-        <w:t xml:space="preserve">MANUAL</w:t>
-      </w:r>
-      <w:r>
-        <w:t xml:space="preserve">,</w:t>
-      </w:r>
-      <w:r>
-        <w:t xml:space="preserve"> </w:t>
-      </w:r>
-      <w:r>
-        <w:rPr>
-          <w:rStyle w:val="VerbatimChar"/>
-        </w:rPr>
-        <w:t xml:space="preserve">SCAN</w:t>
-      </w:r>
-      <w:r>
-        <w:t xml:space="preserve">,</w:t>
-      </w:r>
-      <w:r>
-        <w:t xml:space="preserve"> </w:t>
-      </w:r>
-      <w:r>
-        <w:rPr>
-          <w:rStyle w:val="VerbatimChar"/>
-        </w:rPr>
-        <w:t xml:space="preserve">RNDS</w:t>
-      </w:r>
-      <w:r>
-        <w:t xml:space="preserve">) e uma regra de conciliação: dado oficial prevalece sobre manual; divergências são sinalizadas ao usuário, nunca sobrescritas silenciosamente.</w:t>
+        <w:t xml:space="preserve">spam</w:t>
+      </w:r>
+      <w:r>
+        <w:t xml:space="preserve"> </w:t>
+      </w:r>
+      <w:r>
+        <w:t xml:space="preserve">ou não ser lidos. O login depende apenas de e-mail e senha; autenticação em dois fatores (TOTP) permanece como melhoria futura, e deveria ser obrigatória para administradores.</w:t>
       </w:r>
     </w:p>
     <w:p>
@@ -10510,13 +10430,13 @@
           <w:bCs/>
           <w:b/>
         </w:rPr>
-        <w:t xml:space="preserve">Dependentes.</w:t>
-      </w:r>
-      <w:r>
-        <w:t xml:space="preserve"> </w:t>
-      </w:r>
-      <w:r>
-        <w:t xml:space="preserve">Respeitar as regras do Meu SUS Digital para responsáveis legais, com validação de vínculo.</w:t>
+        <w:t xml:space="preserve">Conformidade com a LGPD incompleta</w:t>
+      </w:r>
+      <w:r>
+        <w:t xml:space="preserve"> </w:t>
+      </w:r>
+      <w:r>
+        <w:t xml:space="preserve">(Seção 6.2).</w:t>
       </w:r>
     </w:p>
     <w:p>
@@ -10532,59 +10452,110 @@
           <w:bCs/>
           <w:b/>
         </w:rPr>
-        <w:t xml:space="preserve">Resiliência.</w:t>
-      </w:r>
-      <w:r>
-        <w:t xml:space="preserve"> </w:t>
-      </w:r>
-      <w:r>
-        <w:t xml:space="preserve">Cache da última sincronização bem-sucedida, indicação ao usuário do horário da última atualização e operação degradada quando a RNDS estiver indisponível, em linha com a tolerância a falhas parciais discutida na Seção 6.3.</w:t>
-      </w:r>
-    </w:p>
-    <w:p>
-      <w:pPr>
-        <w:pStyle w:val="FirstParagraph"/>
+        <w:t xml:space="preserve">Limites do OCR.</w:t>
+      </w:r>
+      <w:r>
+        <w:t xml:space="preserve"> </w:t>
+      </w:r>
+      <w:r>
+        <w:t xml:space="preserve">A leitura é boa para texto impresso ou digital, mas letra manuscrita e carimbos borrados saem com erros; a revisão do usuário é obrigatória. O extrator por regras também reconhece apenas o registro mais recente por envio e depende de o nome da vacina estar no catálogo. O serviço de OCR exige mais memória (carrega modelos de aprendizado de máquina) e precisa ser implantado e monitorado à parte.</w:t>
+      </w:r>
+    </w:p>
+    <w:p>
+      <w:pPr>
+        <w:numPr>
+          <w:ilvl w:val="0"/>
+          <w:numId w:val="1006"/>
+        </w:numPr>
+        <w:pStyle w:val="Compact"/>
       </w:pPr>
       <w:r>
         <w:rPr>
           <w:bCs/>
           <w:b/>
         </w:rPr>
-        <w:t xml:space="preserve">Riscos e dependências:</w:t>
-      </w:r>
-      <w:r>
-        <w:t xml:space="preserve"> </w:t>
-      </w:r>
-      <w:r>
-        <w:t xml:space="preserve">necessidade de convênio ou credenciamento formal, aprovação de segurança do Ministério da Saúde, disponibilidade de ambiente de homologação e mudanças de especificação.</w:t>
-      </w:r>
-    </w:p>
-    <w:bookmarkEnd w:id="77"/>
-    <w:bookmarkStart w:id="78" w:name="integração-com-convênios-e-hospitais"/>
-    <w:p>
-      <w:pPr>
-        <w:pStyle w:val="Heading2"/>
-      </w:pPr>
-      <w:r>
-        <w:t xml:space="preserve">8.2 Integração com convênios e hospitais</w:t>
-      </w:r>
-    </w:p>
-    <w:p>
-      <w:pPr>
-        <w:pStyle w:val="FirstParagraph"/>
+        <w:t xml:space="preserve">Escrita manual de tabelas SQL</w:t>
+      </w:r>
+      <w:r>
+        <w:t xml:space="preserve"> </w:t>
+      </w:r>
+      <w:r>
+        <w:t xml:space="preserve">e migrações por</w:t>
+      </w:r>
+      <w:r>
+        <w:t xml:space="preserve"> </w:t>
+      </w:r>
+      <w:r>
+        <w:rPr>
+          <w:rStyle w:val="VerbatimChar"/>
+        </w:rPr>
+        <w:t xml:space="preserve">ALTER TABLE</w:t>
+      </w:r>
+      <w:r>
+        <w:t xml:space="preserve"> </w:t>
+      </w:r>
+      <w:r>
+        <w:t xml:space="preserve">com tratamento de erro, em vez de ferramenta de migração versionada. O esquema Prisma no repositório está incompleto em relação às tabelas reais, o que gera inconsistência de manutenção.</w:t>
+      </w:r>
+    </w:p>
+    <w:p>
+      <w:pPr>
+        <w:numPr>
+          <w:ilvl w:val="0"/>
+          <w:numId w:val="1006"/>
+        </w:numPr>
+        <w:pStyle w:val="Compact"/>
       </w:pPr>
       <w:r>
         <w:rPr>
           <w:bCs/>
           <w:b/>
         </w:rPr>
+        <w:t xml:space="preserve">Ausência de avaliação com usuários.</w:t>
+      </w:r>
+      <w:r>
+        <w:t xml:space="preserve"> </w:t>
+      </w:r>
+      <w:r>
+        <w:t xml:space="preserve">Não houve teste de usabilidade com público-alvo, em especial idosos e pessoas de baixa familiaridade digital.</w:t>
+      </w:r>
+    </w:p>
+    <w:bookmarkEnd w:id="75"/>
+    <w:bookmarkEnd w:id="76"/>
+    <w:bookmarkStart w:id="82" w:name="melhorias-futuras"/>
+    <w:p>
+      <w:pPr>
+        <w:pStyle w:val="Heading1"/>
+      </w:pPr>
+      <w:r>
+        <w:t xml:space="preserve">8 MELHORIAS FUTURAS</w:t>
+      </w:r>
+    </w:p>
+    <w:bookmarkStart w:id="77" w:name="integração-com-o-meu-sus-digital-gov.br"/>
+    <w:p>
+      <w:pPr>
+        <w:pStyle w:val="Heading2"/>
+      </w:pPr>
+      <w:r>
+        <w:t xml:space="preserve">8.1 Integração com o Meu SUS Digital (gov.br)</w:t>
+      </w:r>
+    </w:p>
+    <w:p>
+      <w:pPr>
+        <w:pStyle w:val="FirstParagraph"/>
+      </w:pPr>
+      <w:r>
+        <w:rPr>
+          <w:bCs/>
+          <w:b/>
+        </w:rPr>
         <w:t xml:space="preserve">Objetivo:</w:t>
       </w:r>
       <w:r>
         <w:t xml:space="preserve"> </w:t>
       </w:r>
       <w:r>
-        <w:t xml:space="preserve">capturar doses aplicadas na rede privada e suplementar, hoje a principal lacuna da carteira digital pública.</w:t>
+        <w:t xml:space="preserve">buscar e atualizar automaticamente a carteira vacinal oficial do cidadão, eliminando a digitação.</w:t>
       </w:r>
     </w:p>
     <w:p>
@@ -10612,40 +10583,29 @@
           <w:bCs/>
           <w:b/>
         </w:rPr>
-        <w:t xml:space="preserve">API de integração com padrão FHIR</w:t>
-      </w:r>
-      <w:r>
-        <w:t xml:space="preserve"> </w:t>
-      </w:r>
-      <w:r>
-        <w:t xml:space="preserve">(recurso</w:t>
-      </w:r>
-      <w:r>
-        <w:t xml:space="preserve"> </w:t>
-      </w:r>
-      <w:r>
-        <w:rPr>
-          <w:rStyle w:val="VerbatimChar"/>
-        </w:rPr>
-        <w:t xml:space="preserve">Immunization</w:t>
-      </w:r>
-      <w:r>
-        <w:t xml:space="preserve"> </w:t>
-      </w:r>
-      <w:r>
-        <w:t xml:space="preserve">e</w:t>
-      </w:r>
-      <w:r>
-        <w:t xml:space="preserve"> </w:t>
-      </w:r>
-      <w:r>
-        <w:rPr>
-          <w:rStyle w:val="VerbatimChar"/>
-        </w:rPr>
-        <w:t xml:space="preserve">Patient</w:t>
-      </w:r>
-      <w:r>
-        <w:t xml:space="preserve">), com contratos documentados em OpenAPI, para que clínicas, hospitais e operadoras enviem ou publiquem as doses aplicadas.</w:t>
+        <w:t xml:space="preserve">Identidade federada.</w:t>
+      </w:r>
+      <w:r>
+        <w:t xml:space="preserve"> </w:t>
+      </w:r>
+      <w:r>
+        <w:t xml:space="preserve">Adotar o login único</w:t>
+      </w:r>
+      <w:r>
+        <w:t xml:space="preserve"> </w:t>
+      </w:r>
+      <w:r>
+        <w:rPr>
+          <w:bCs/>
+          <w:b/>
+        </w:rPr>
+        <w:t xml:space="preserve">gov.br</w:t>
+      </w:r>
+      <w:r>
+        <w:t xml:space="preserve"> </w:t>
+      </w:r>
+      <w:r>
+        <w:t xml:space="preserve">(OAuth 2.0 / OpenID Connect) como método de autenticação, com nível de confiabilidade prata ou ouro, substituindo ou complementando o cadastro por e-mail e senha. O CPF validado passa a ser chave de identificação.</w:t>
       </w:r>
     </w:p>
     <w:p>
@@ -10661,29 +10621,13 @@
           <w:bCs/>
           <w:b/>
         </w:rPr>
-        <w:t xml:space="preserve">Autenticação entre sistemas</w:t>
-      </w:r>
-      <w:r>
-        <w:t xml:space="preserve"> </w:t>
-      </w:r>
-      <w:r>
-        <w:t xml:space="preserve">com OAuth 2.0</w:t>
-      </w:r>
-      <w:r>
-        <w:t xml:space="preserve"> </w:t>
-      </w:r>
-      <w:r>
-        <w:rPr>
-          <w:iCs/>
-          <w:i/>
-        </w:rPr>
-        <w:t xml:space="preserve">client credentials</w:t>
-      </w:r>
-      <w:r>
-        <w:t xml:space="preserve"> </w:t>
-      </w:r>
-      <w:r>
-        <w:t xml:space="preserve">ou mTLS, e escopos por parceiro.</w:t>
+        <w:t xml:space="preserve">Consentimento explícito.</w:t>
+      </w:r>
+      <w:r>
+        <w:t xml:space="preserve"> </w:t>
+      </w:r>
+      <w:r>
+        <w:t xml:space="preserve">Tela que informe quais dados serão lidos, para qual finalidade e por quanto tempo, com possibilidade de revogação (LGPD, arts. 7º, 8º e 11).</w:t>
       </w:r>
     </w:p>
     <w:p>
@@ -10699,13 +10643,41 @@
           <w:bCs/>
           <w:b/>
         </w:rPr>
-        <w:t xml:space="preserve">Consentimento do titular</w:t>
-      </w:r>
-      <w:r>
-        <w:t xml:space="preserve"> </w:t>
-      </w:r>
-      <w:r>
-        <w:t xml:space="preserve">para cada parceiro, com revogação.</w:t>
+        <w:t xml:space="preserve">Consumo da RNDS.</w:t>
+      </w:r>
+      <w:r>
+        <w:t xml:space="preserve"> </w:t>
+      </w:r>
+      <w:r>
+        <w:t xml:space="preserve">Credenciar o sistema junto ao Ministério da Saúde como solução integradora e consumir o histórico de imunização em formato</w:t>
+      </w:r>
+      <w:r>
+        <w:t xml:space="preserve"> </w:t>
+      </w:r>
+      <w:r>
+        <w:rPr>
+          <w:bCs/>
+          <w:b/>
+        </w:rPr>
+        <w:t xml:space="preserve">HL7 FHIR</w:t>
+      </w:r>
+      <w:r>
+        <w:t xml:space="preserve"> </w:t>
+      </w:r>
+      <w:r>
+        <w:t xml:space="preserve">(recurso</w:t>
+      </w:r>
+      <w:r>
+        <w:t xml:space="preserve"> </w:t>
+      </w:r>
+      <w:r>
+        <w:rPr>
+          <w:rStyle w:val="VerbatimChar"/>
+        </w:rPr>
+        <w:t xml:space="preserve">Immunization</w:t>
+      </w:r>
+      <w:r>
+        <w:t xml:space="preserve">), mapeando os códigos de imunobiológico do SI-PNI para o catálogo local de vacinas. O mapeamento deve ser tabelado e versionado.</w:t>
       </w:r>
     </w:p>
     <w:p>
@@ -10721,13 +10693,13 @@
           <w:bCs/>
           <w:b/>
         </w:rPr>
-        <w:t xml:space="preserve">Eventos assíncronos.</w:t>
-      </w:r>
-      <w:r>
-        <w:t xml:space="preserve"> </w:t>
-      </w:r>
-      <w:r>
-        <w:t xml:space="preserve">Uso de fila de mensagens (como RabbitMQ ou Kafka) ou</w:t>
+        <w:t xml:space="preserve">Sincronização.</w:t>
+      </w:r>
+      <w:r>
+        <w:t xml:space="preserve"> </w:t>
+      </w:r>
+      <w:r>
+        <w:t xml:space="preserve">Um</w:t>
       </w:r>
       <w:r>
         <w:t xml:space="preserve"> </w:t>
@@ -10737,13 +10709,45 @@
           <w:iCs/>
           <w:i/>
         </w:rPr>
-        <w:t xml:space="preserve">webhooks</w:t>
-      </w:r>
-      <w:r>
-        <w:t xml:space="preserve"> </w:t>
-      </w:r>
-      <w:r>
-        <w:t xml:space="preserve">com assinatura HMAC para receber eventos de vacinação, com</w:t>
+        <w:t xml:space="preserve">worker</w:t>
+      </w:r>
+      <w:r>
+        <w:t xml:space="preserve"> </w:t>
+      </w:r>
+      <w:r>
+        <w:t xml:space="preserve">assíncrono consulta periodicamente a RNDS, com política de</w:t>
+      </w:r>
+      <w:r>
+        <w:t xml:space="preserve"> </w:t>
+      </w:r>
+      <w:r>
+        <w:rPr>
+          <w:iCs/>
+          <w:i/>
+        </w:rPr>
+        <w:t xml:space="preserve">retry</w:t>
+      </w:r>
+      <w:r>
+        <w:t xml:space="preserve"> </w:t>
+      </w:r>
+      <w:r>
+        <w:t xml:space="preserve">e</w:t>
+      </w:r>
+      <w:r>
+        <w:t xml:space="preserve"> </w:t>
+      </w:r>
+      <w:r>
+        <w:rPr>
+          <w:iCs/>
+          <w:i/>
+        </w:rPr>
+        <w:t xml:space="preserve">backoff</w:t>
+      </w:r>
+      <w:r>
+        <w:t xml:space="preserve"> </w:t>
+      </w:r>
+      <w:r>
+        <w:t xml:space="preserve">exponencial. A carteira local passa a ter um campo</w:t>
       </w:r>
       <w:r>
         <w:t xml:space="preserve"> </w:t>
@@ -10753,13 +10757,46 @@
           <w:bCs/>
           <w:b/>
         </w:rPr>
-        <w:t xml:space="preserve">idempotência</w:t>
-      </w:r>
-      <w:r>
-        <w:t xml:space="preserve"> </w:t>
-      </w:r>
-      <w:r>
-        <w:t xml:space="preserve">por identificador do evento externo, evitando duplicação.</w:t>
+        <w:t xml:space="preserve">origem</w:t>
+      </w:r>
+      <w:r>
+        <w:t xml:space="preserve"> </w:t>
+      </w:r>
+      <w:r>
+        <w:t xml:space="preserve">(</w:t>
+      </w:r>
+      <w:r>
+        <w:rPr>
+          <w:rStyle w:val="VerbatimChar"/>
+        </w:rPr>
+        <w:t xml:space="preserve">MANUAL</w:t>
+      </w:r>
+      <w:r>
+        <w:t xml:space="preserve">,</w:t>
+      </w:r>
+      <w:r>
+        <w:t xml:space="preserve"> </w:t>
+      </w:r>
+      <w:r>
+        <w:rPr>
+          <w:rStyle w:val="VerbatimChar"/>
+        </w:rPr>
+        <w:t xml:space="preserve">SCAN</w:t>
+      </w:r>
+      <w:r>
+        <w:t xml:space="preserve">,</w:t>
+      </w:r>
+      <w:r>
+        <w:t xml:space="preserve"> </w:t>
+      </w:r>
+      <w:r>
+        <w:rPr>
+          <w:rStyle w:val="VerbatimChar"/>
+        </w:rPr>
+        <w:t xml:space="preserve">RNDS</w:t>
+      </w:r>
+      <w:r>
+        <w:t xml:space="preserve">) e uma regra de conciliação: dado oficial prevalece sobre manual; divergências são sinalizadas ao usuário, nunca sobrescritas silenciosamente.</w:t>
       </w:r>
     </w:p>
     <w:p>
@@ -10775,13 +10812,13 @@
           <w:bCs/>
           <w:b/>
         </w:rPr>
-        <w:t xml:space="preserve">Resolução de identidade.</w:t>
-      </w:r>
-      <w:r>
-        <w:t xml:space="preserve"> </w:t>
-      </w:r>
-      <w:r>
-        <w:t xml:space="preserve">Correspondência por CPF e Cartão Nacional de Saúde, com tratamento de homônimos e registros incompletos.</w:t>
+        <w:t xml:space="preserve">Dependentes.</w:t>
+      </w:r>
+      <w:r>
+        <w:t xml:space="preserve"> </w:t>
+      </w:r>
+      <w:r>
+        <w:t xml:space="preserve">Respeitar as regras do Meu SUS Digital para responsáveis legais, com validação de vínculo.</w:t>
       </w:r>
     </w:p>
     <w:p>
@@ -10797,45 +10834,71 @@
           <w:bCs/>
           <w:b/>
         </w:rPr>
-        <w:t xml:space="preserve">Via convênios.</w:t>
-      </w:r>
-      <w:r>
-        <w:t xml:space="preserve"> </w:t>
-      </w:r>
-      <w:r>
-        <w:t xml:space="preserve">Notificar o beneficiário de vacinas disponíveis em sua cobertura e indicar a rede credenciada próxima, usando o endereço já cadastrado.</w:t>
-      </w:r>
-    </w:p>
-    <w:p>
-      <w:pPr>
-        <w:numPr>
-          <w:ilvl w:val="0"/>
-          <w:numId w:val="1007"/>
-        </w:numPr>
-        <w:pStyle w:val="Compact"/>
+        <w:t xml:space="preserve">Resiliência.</w:t>
+      </w:r>
+      <w:r>
+        <w:t xml:space="preserve"> </w:t>
+      </w:r>
+      <w:r>
+        <w:t xml:space="preserve">Cache da última sincronização bem-sucedida, indicação ao usuário do horário da última atualização e operação degradada quando a RNDS estiver indisponível, em linha com a tolerância a falhas parciais discutida na Seção 6.3.</w:t>
+      </w:r>
+    </w:p>
+    <w:p>
+      <w:pPr>
+        <w:pStyle w:val="FirstParagraph"/>
       </w:pPr>
       <w:r>
         <w:rPr>
           <w:bCs/>
           <w:b/>
         </w:rPr>
-        <w:t xml:space="preserve">Auditoria.</w:t>
-      </w:r>
-      <w:r>
-        <w:t xml:space="preserve"> </w:t>
-      </w:r>
-      <w:r>
-        <w:t xml:space="preserve">Registro imutável de toda alteração vinda de terceiros, com quem enviou, quando e o quê.</w:t>
-      </w:r>
-    </w:p>
-    <w:bookmarkEnd w:id="78"/>
-    <w:bookmarkStart w:id="79" w:name="evolução-do-domínio-vacinal"/>
+        <w:t xml:space="preserve">Riscos e dependências:</w:t>
+      </w:r>
+      <w:r>
+        <w:t xml:space="preserve"> </w:t>
+      </w:r>
+      <w:r>
+        <w:t xml:space="preserve">necessidade de convênio ou credenciamento formal, aprovação de segurança do Ministério da Saúde, disponibilidade de ambiente de homologação e mudanças de especificação.</w:t>
+      </w:r>
+    </w:p>
+    <w:bookmarkEnd w:id="77"/>
+    <w:bookmarkStart w:id="78" w:name="integração-com-convênios-e-hospitais"/>
     <w:p>
       <w:pPr>
         <w:pStyle w:val="Heading2"/>
       </w:pPr>
       <w:r>
-        <w:t xml:space="preserve">8.3 Evolução do domínio vacinal</w:t>
+        <w:t xml:space="preserve">8.2 Integração com convênios e hospitais</w:t>
+      </w:r>
+    </w:p>
+    <w:p>
+      <w:pPr>
+        <w:pStyle w:val="FirstParagraph"/>
+      </w:pPr>
+      <w:r>
+        <w:rPr>
+          <w:bCs/>
+          <w:b/>
+        </w:rPr>
+        <w:t xml:space="preserve">Objetivo:</w:t>
+      </w:r>
+      <w:r>
+        <w:t xml:space="preserve"> </w:t>
+      </w:r>
+      <w:r>
+        <w:t xml:space="preserve">capturar doses aplicadas na rede privada e suplementar, hoje a principal lacuna da carteira digital pública.</w:t>
+      </w:r>
+    </w:p>
+    <w:p>
+      <w:pPr>
+        <w:pStyle w:val="BodyText"/>
+      </w:pPr>
+      <w:r>
+        <w:rPr>
+          <w:bCs/>
+          <w:b/>
+        </w:rPr>
+        <w:t xml:space="preserve">Proposta técnica:</w:t>
       </w:r>
     </w:p>
     <w:p>
@@ -10847,7 +10910,44 @@
         <w:pStyle w:val="Compact"/>
       </w:pPr>
       <w:r>
-        <w:t xml:space="preserve">Intervalos mínimos e máximos entre doses, idade mínima por dose e esquemas de resgate, possivelmente por um motor de regras declarativas.</w:t>
+        <w:rPr>
+          <w:bCs/>
+          <w:b/>
+        </w:rPr>
+        <w:t xml:space="preserve">API de integração com padrão FHIR</w:t>
+      </w:r>
+      <w:r>
+        <w:t xml:space="preserve"> </w:t>
+      </w:r>
+      <w:r>
+        <w:t xml:space="preserve">(recurso</w:t>
+      </w:r>
+      <w:r>
+        <w:t xml:space="preserve"> </w:t>
+      </w:r>
+      <w:r>
+        <w:rPr>
+          <w:rStyle w:val="VerbatimChar"/>
+        </w:rPr>
+        <w:t xml:space="preserve">Immunization</w:t>
+      </w:r>
+      <w:r>
+        <w:t xml:space="preserve"> </w:t>
+      </w:r>
+      <w:r>
+        <w:t xml:space="preserve">e</w:t>
+      </w:r>
+      <w:r>
+        <w:t xml:space="preserve"> </w:t>
+      </w:r>
+      <w:r>
+        <w:rPr>
+          <w:rStyle w:val="VerbatimChar"/>
+        </w:rPr>
+        <w:t xml:space="preserve">Patient</w:t>
+      </w:r>
+      <w:r>
+        <w:t xml:space="preserve">), com contratos documentados em OpenAPI, para que clínicas, hospitais e operadoras enviem ou publiquem as doses aplicadas.</w:t>
       </w:r>
     </w:p>
     <w:p>
@@ -10859,23 +10959,33 @@
         <w:pStyle w:val="Compact"/>
       </w:pPr>
       <w:r>
-        <w:t xml:space="preserve">Calendário por</w:t>
-      </w:r>
-      <w:r>
-        <w:t xml:space="preserve"> </w:t>
-      </w:r>
-      <w:r>
         <w:rPr>
           <w:bCs/>
           <w:b/>
         </w:rPr>
-        <w:t xml:space="preserve">idade em meses</w:t>
-      </w:r>
-      <w:r>
-        <w:t xml:space="preserve"> </w:t>
-      </w:r>
-      <w:r>
-        <w:t xml:space="preserve">para os primeiros dois anos de vida.</w:t>
+        <w:t xml:space="preserve">Autenticação entre sistemas</w:t>
+      </w:r>
+      <w:r>
+        <w:t xml:space="preserve"> </w:t>
+      </w:r>
+      <w:r>
+        <w:t xml:space="preserve">com OAuth 2.0</w:t>
+      </w:r>
+      <w:r>
+        <w:t xml:space="preserve"> </w:t>
+      </w:r>
+      <w:r>
+        <w:rPr>
+          <w:iCs/>
+          <w:i/>
+        </w:rPr>
+        <w:t xml:space="preserve">client credentials</w:t>
+      </w:r>
+      <w:r>
+        <w:t xml:space="preserve"> </w:t>
+      </w:r>
+      <w:r>
+        <w:t xml:space="preserve">ou mTLS, e escopos por parceiro.</w:t>
       </w:r>
     </w:p>
     <w:p>
@@ -10887,7 +10997,17 @@
         <w:pStyle w:val="Compact"/>
       </w:pPr>
       <w:r>
-        <w:t xml:space="preserve">Regras completas para gestantes, imunocomprometidos, viajantes e trabalhadores de saúde.</w:t>
+        <w:rPr>
+          <w:bCs/>
+          <w:b/>
+        </w:rPr>
+        <w:t xml:space="preserve">Consentimento do titular</w:t>
+      </w:r>
+      <w:r>
+        <w:t xml:space="preserve"> </w:t>
+      </w:r>
+      <w:r>
+        <w:t xml:space="preserve">para cada parceiro, com revogação.</w:t>
       </w:r>
     </w:p>
     <w:p>
@@ -10899,23 +11019,49 @@
         <w:pStyle w:val="Compact"/>
       </w:pPr>
       <w:r>
-        <w:t xml:space="preserve">Alertas de</w:t>
-      </w:r>
-      <w:r>
-        <w:t xml:space="preserve"> </w:t>
-      </w:r>
-      <w:r>
         <w:rPr>
           <w:bCs/>
           <w:b/>
         </w:rPr>
-        <w:t xml:space="preserve">campanhas e surtos</w:t>
-      </w:r>
-      <w:r>
-        <w:t xml:space="preserve"> </w:t>
-      </w:r>
-      <w:r>
-        <w:t xml:space="preserve">regionais, vinculando o CEP do usuário a avisos oficiais.</w:t>
+        <w:t xml:space="preserve">Eventos assíncronos.</w:t>
+      </w:r>
+      <w:r>
+        <w:t xml:space="preserve"> </w:t>
+      </w:r>
+      <w:r>
+        <w:t xml:space="preserve">Uso de fila de mensagens (como RabbitMQ ou Kafka) ou</w:t>
+      </w:r>
+      <w:r>
+        <w:t xml:space="preserve"> </w:t>
+      </w:r>
+      <w:r>
+        <w:rPr>
+          <w:iCs/>
+          <w:i/>
+        </w:rPr>
+        <w:t xml:space="preserve">webhooks</w:t>
+      </w:r>
+      <w:r>
+        <w:t xml:space="preserve"> </w:t>
+      </w:r>
+      <w:r>
+        <w:t xml:space="preserve">com assinatura HMAC para receber eventos de vacinação, com</w:t>
+      </w:r>
+      <w:r>
+        <w:t xml:space="preserve"> </w:t>
+      </w:r>
+      <w:r>
+        <w:rPr>
+          <w:bCs/>
+          <w:b/>
+        </w:rPr>
+        <w:t xml:space="preserve">idempotência</w:t>
+      </w:r>
+      <w:r>
+        <w:t xml:space="preserve"> </w:t>
+      </w:r>
+      <w:r>
+        <w:t xml:space="preserve">por identificador do evento externo, evitando duplicação.</w:t>
       </w:r>
     </w:p>
     <w:p>
@@ -10923,6 +11069,162 @@
         <w:numPr>
           <w:ilvl w:val="0"/>
           <w:numId w:val="1008"/>
+        </w:numPr>
+        <w:pStyle w:val="Compact"/>
+      </w:pPr>
+      <w:r>
+        <w:rPr>
+          <w:bCs/>
+          <w:b/>
+        </w:rPr>
+        <w:t xml:space="preserve">Resolução de identidade.</w:t>
+      </w:r>
+      <w:r>
+        <w:t xml:space="preserve"> </w:t>
+      </w:r>
+      <w:r>
+        <w:t xml:space="preserve">Correspondência por CPF e Cartão Nacional de Saúde, com tratamento de homônimos e registros incompletos.</w:t>
+      </w:r>
+    </w:p>
+    <w:p>
+      <w:pPr>
+        <w:numPr>
+          <w:ilvl w:val="0"/>
+          <w:numId w:val="1008"/>
+        </w:numPr>
+        <w:pStyle w:val="Compact"/>
+      </w:pPr>
+      <w:r>
+        <w:rPr>
+          <w:bCs/>
+          <w:b/>
+        </w:rPr>
+        <w:t xml:space="preserve">Via convênios.</w:t>
+      </w:r>
+      <w:r>
+        <w:t xml:space="preserve"> </w:t>
+      </w:r>
+      <w:r>
+        <w:t xml:space="preserve">Notificar o beneficiário de vacinas disponíveis em sua cobertura e indicar a rede credenciada próxima, usando o endereço já cadastrado.</w:t>
+      </w:r>
+    </w:p>
+    <w:p>
+      <w:pPr>
+        <w:numPr>
+          <w:ilvl w:val="0"/>
+          <w:numId w:val="1008"/>
+        </w:numPr>
+        <w:pStyle w:val="Compact"/>
+      </w:pPr>
+      <w:r>
+        <w:rPr>
+          <w:bCs/>
+          <w:b/>
+        </w:rPr>
+        <w:t xml:space="preserve">Auditoria.</w:t>
+      </w:r>
+      <w:r>
+        <w:t xml:space="preserve"> </w:t>
+      </w:r>
+      <w:r>
+        <w:t xml:space="preserve">Registro imutável de toda alteração vinda de terceiros, com quem enviou, quando e o quê.</w:t>
+      </w:r>
+    </w:p>
+    <w:bookmarkEnd w:id="78"/>
+    <w:bookmarkStart w:id="79" w:name="evolução-do-domínio-vacinal"/>
+    <w:p>
+      <w:pPr>
+        <w:pStyle w:val="Heading2"/>
+      </w:pPr>
+      <w:r>
+        <w:t xml:space="preserve">8.3 Evolução do domínio vacinal</w:t>
+      </w:r>
+    </w:p>
+    <w:p>
+      <w:pPr>
+        <w:numPr>
+          <w:ilvl w:val="0"/>
+          <w:numId w:val="1009"/>
+        </w:numPr>
+        <w:pStyle w:val="Compact"/>
+      </w:pPr>
+      <w:r>
+        <w:t xml:space="preserve">Intervalos mínimos e máximos entre doses, idade mínima por dose e esquemas de resgate, possivelmente por um motor de regras declarativas.</w:t>
+      </w:r>
+    </w:p>
+    <w:p>
+      <w:pPr>
+        <w:numPr>
+          <w:ilvl w:val="0"/>
+          <w:numId w:val="1009"/>
+        </w:numPr>
+        <w:pStyle w:val="Compact"/>
+      </w:pPr>
+      <w:r>
+        <w:t xml:space="preserve">Calendário por</w:t>
+      </w:r>
+      <w:r>
+        <w:t xml:space="preserve"> </w:t>
+      </w:r>
+      <w:r>
+        <w:rPr>
+          <w:bCs/>
+          <w:b/>
+        </w:rPr>
+        <w:t xml:space="preserve">idade em meses</w:t>
+      </w:r>
+      <w:r>
+        <w:t xml:space="preserve"> </w:t>
+      </w:r>
+      <w:r>
+        <w:t xml:space="preserve">para os primeiros dois anos de vida.</w:t>
+      </w:r>
+    </w:p>
+    <w:p>
+      <w:pPr>
+        <w:numPr>
+          <w:ilvl w:val="0"/>
+          <w:numId w:val="1009"/>
+        </w:numPr>
+        <w:pStyle w:val="Compact"/>
+      </w:pPr>
+      <w:r>
+        <w:t xml:space="preserve">Regras completas para gestantes, imunocomprometidos, viajantes e trabalhadores de saúde.</w:t>
+      </w:r>
+    </w:p>
+    <w:p>
+      <w:pPr>
+        <w:numPr>
+          <w:ilvl w:val="0"/>
+          <w:numId w:val="1009"/>
+        </w:numPr>
+        <w:pStyle w:val="Compact"/>
+      </w:pPr>
+      <w:r>
+        <w:t xml:space="preserve">Alertas de</w:t>
+      </w:r>
+      <w:r>
+        <w:t xml:space="preserve"> </w:t>
+      </w:r>
+      <w:r>
+        <w:rPr>
+          <w:bCs/>
+          <w:b/>
+        </w:rPr>
+        <w:t xml:space="preserve">campanhas e surtos</w:t>
+      </w:r>
+      <w:r>
+        <w:t xml:space="preserve"> </w:t>
+      </w:r>
+      <w:r>
+        <w:t xml:space="preserve">regionais, vinculando o CEP do usuário a avisos oficiais.</w:t>
+      </w:r>
+    </w:p>
+    <w:p>
+      <w:pPr>
+        <w:numPr>
+          <w:ilvl w:val="0"/>
+          <w:numId w:val="1009"/>
         </w:numPr>
         <w:pStyle w:val="Compact"/>
       </w:pPr>
@@ -11264,19 +11566,19 @@
               <w:jc w:val="left"/>
             </w:pPr>
             <w:r>
-              <w:t xml:space="preserve">IA</w:t>
-            </w:r>
-          </w:p>
-        </w:tc>
-        <w:tc>
-          <w:tcPr/>
-          <w:p>
-            <w:pPr>
-              <w:pStyle w:val="Compact"/>
-              <w:jc w:val="left"/>
-            </w:pPr>
-            <w:r>
-              <w:t xml:space="preserve">Pontuação de confiança por campo, instrução ao usuário para melhorar a foto, leitura de várias linhas da carteirinha em lote.</w:t>
+              <w:t xml:space="preserve">OCR</w:t>
+            </w:r>
+          </w:p>
+        </w:tc>
+        <w:tc>
+          <w:tcPr/>
+          <w:p>
+            <w:pPr>
+              <w:pStyle w:val="Compact"/>
+              <w:jc w:val="left"/>
+            </w:pPr>
+            <w:r>
+              <w:t xml:space="preserve">Pontuação de confiança por campo, instrução ao usuário para melhorar a foto, leitura de todas as linhas da carteirinha em lote, avaliação de acurácia com um conjunto de carteirinhas reais, e tratamento de letra manuscrita.</w:t>
             </w:r>
           </w:p>
         </w:tc>
@@ -12058,19 +12360,19 @@
               <w:rPr>
                 <w:rStyle w:val="VerbatimChar"/>
               </w:rPr>
-              <w:t xml:space="preserve">ANTHROPIC_API_KEY</w:t>
-            </w:r>
-          </w:p>
-        </w:tc>
-        <w:tc>
-          <w:tcPr/>
-          <w:p>
-            <w:pPr>
-              <w:pStyle w:val="Compact"/>
-              <w:jc w:val="left"/>
-            </w:pPr>
-            <w:r>
-              <w:t xml:space="preserve">Chave do serviço de visão.</w:t>
+              <w:t xml:space="preserve">OCR_SERVICE_URL</w:t>
+            </w:r>
+          </w:p>
+        </w:tc>
+        <w:tc>
+          <w:tcPr/>
+          <w:p>
+            <w:pPr>
+              <w:pStyle w:val="Compact"/>
+              <w:jc w:val="left"/>
+            </w:pPr>
+            <w:r>
+              <w:t xml:space="preserve">URL do serviço de OCR (Docling).</w:t>
             </w:r>
           </w:p>
         </w:tc>
@@ -12686,6 +12988,9 @@
     <w:abstractNumId w:val="991"/>
   </w:num>
   <w:num w:numId="1003">
+    <w:abstractNumId w:val="991"/>
+  </w:num>
+  <w:num w:numId="1004">
     <w:abstractNumId w:val="99411"/>
     <w:lvlOverride w:ilvl="0">
       <w:startOverride w:val="1"/>
@@ -12715,38 +13020,8 @@
       <w:startOverride w:val="1"/>
     </w:lvlOverride>
   </w:num>
-  <w:num w:numId="1004">
+  <w:num w:numId="1005">
     <w:abstractNumId w:val="991"/>
-  </w:num>
-  <w:num w:numId="1005">
-    <w:abstractNumId w:val="99411"/>
-    <w:lvlOverride w:ilvl="0">
-      <w:startOverride w:val="1"/>
-    </w:lvlOverride>
-    <w:lvlOverride w:ilvl="1">
-      <w:startOverride w:val="1"/>
-    </w:lvlOverride>
-    <w:lvlOverride w:ilvl="2">
-      <w:startOverride w:val="1"/>
-    </w:lvlOverride>
-    <w:lvlOverride w:ilvl="3">
-      <w:startOverride w:val="1"/>
-    </w:lvlOverride>
-    <w:lvlOverride w:ilvl="4">
-      <w:startOverride w:val="1"/>
-    </w:lvlOverride>
-    <w:lvlOverride w:ilvl="5">
-      <w:startOverride w:val="1"/>
-    </w:lvlOverride>
-    <w:lvlOverride w:ilvl="6">
-      <w:startOverride w:val="1"/>
-    </w:lvlOverride>
-    <w:lvlOverride w:ilvl="7">
-      <w:startOverride w:val="1"/>
-    </w:lvlOverride>
-    <w:lvlOverride w:ilvl="8">
-      <w:startOverride w:val="1"/>
-    </w:lvlOverride>
   </w:num>
   <w:num w:numId="1006">
     <w:abstractNumId w:val="99411"/>
@@ -12809,6 +13084,36 @@
     </w:lvlOverride>
   </w:num>
   <w:num w:numId="1008">
+    <w:abstractNumId w:val="99411"/>
+    <w:lvlOverride w:ilvl="0">
+      <w:startOverride w:val="1"/>
+    </w:lvlOverride>
+    <w:lvlOverride w:ilvl="1">
+      <w:startOverride w:val="1"/>
+    </w:lvlOverride>
+    <w:lvlOverride w:ilvl="2">
+      <w:startOverride w:val="1"/>
+    </w:lvlOverride>
+    <w:lvlOverride w:ilvl="3">
+      <w:startOverride w:val="1"/>
+    </w:lvlOverride>
+    <w:lvlOverride w:ilvl="4">
+      <w:startOverride w:val="1"/>
+    </w:lvlOverride>
+    <w:lvlOverride w:ilvl="5">
+      <w:startOverride w:val="1"/>
+    </w:lvlOverride>
+    <w:lvlOverride w:ilvl="6">
+      <w:startOverride w:val="1"/>
+    </w:lvlOverride>
+    <w:lvlOverride w:ilvl="7">
+      <w:startOverride w:val="1"/>
+    </w:lvlOverride>
+    <w:lvlOverride w:ilvl="8">
+      <w:startOverride w:val="1"/>
+    </w:lvlOverride>
+  </w:num>
+  <w:num w:numId="1009">
     <w:abstractNumId w:val="991"/>
   </w:num>
 </w:numbering>

</xml_diff>

<commit_message>
Calcula a proxima dose de cada vacina e a data em que e devida (Calendario Nacional 2026)
- Esquema vacinal 2026 transcrito dos calendarios do Ministerio da Saude:
  idade recomendada, intervalo minimo, janela de idade e grupo especial
- Funcao pura que calcula a data prevista (maior entre nascimento + idade
  recomendada e ultima dose + intervalo) e o status (atrasada, disponivel,
  proxima, futura); reforcos periodicos (dT, influenza, COVID-19)
- Resumo do Dashboard passa a cobrar so o que ja venceu e lista as proximas
  doses com data; novo GET /pendencias/:pessoaId/proximas-doses
- Faixas etarias alinhadas aos calendarios (crianca 0-9, adolescente 10-24,
  adulto 25-59, idoso 60+)
- Auditoria do banco e da logica contra os calendarios (docs/auditoria-calendario-2026.md)
- Testes (unitarios e com banco) e monografia atualizada
</commit_message>
<xml_diff>
--- a/docs/monografia/Monografia-NotificaVacinas.docx
+++ b/docs/monografia/Monografia-NotificaVacinas.docx
@@ -2793,6 +2793,32 @@
           </w:p>
         </w:tc>
       </w:tr>
+      <w:tr>
+        <w:tc>
+          <w:tcPr/>
+          <w:p>
+            <w:pPr>
+              <w:pStyle w:val="Compact"/>
+              <w:jc w:val="left"/>
+            </w:pPr>
+            <w:r>
+              <w:t xml:space="preserve">RF14</w:t>
+            </w:r>
+          </w:p>
+        </w:tc>
+        <w:tc>
+          <w:tcPr/>
+          <w:p>
+            <w:pPr>
+              <w:pStyle w:val="Compact"/>
+              <w:jc w:val="left"/>
+            </w:pPr>
+            <w:r>
+              <w:t xml:space="preserve">O sistema deve calcular, para cada vacina, a próxima dose e a data em que ela é devida, a partir da idade e da data da última dose registrada.</w:t>
+            </w:r>
+          </w:p>
+        </w:tc>
+      </w:tr>
     </w:tbl>
     <w:bookmarkEnd w:id="49"/>
     <w:bookmarkStart w:id="50" w:name="requisitos-não-funcionais"/>
@@ -3363,7 +3389,36 @@
         <w:t xml:space="preserve"> </w:t>
       </w:r>
       <w:r>
-        <w:t xml:space="preserve">Uma vacina está</w:t>
+        <w:t xml:space="preserve">Uma dose só é</w:t>
+      </w:r>
+      <w:r>
+        <w:t xml:space="preserve"> </w:t>
+      </w:r>
+      <w:r>
+        <w:rPr>
+          <w:bCs/>
+          <w:b/>
+        </w:rPr>
+        <w:t xml:space="preserve">pendente</w:t>
+      </w:r>
+      <w:r>
+        <w:t xml:space="preserve"> </w:t>
+      </w:r>
+      <w:r>
+        <w:t xml:space="preserve">depois da data em que é devida (idade recomendada ou intervalo mínimo desde a dose anterior, o que ocorrer por último); antes disso, é uma dose</w:t>
+      </w:r>
+      <w:r>
+        <w:t xml:space="preserve"> </w:t>
+      </w:r>
+      <w:r>
+        <w:rPr>
+          <w:bCs/>
+          <w:b/>
+        </w:rPr>
+        <w:t xml:space="preserve">próxima</w:t>
+      </w:r>
+      <w:r>
+        <w:t xml:space="preserve">, com data prevista. Uma vacina está</w:t>
       </w:r>
       <w:r>
         <w:t xml:space="preserve"> </w:t>
@@ -3379,7 +3434,7 @@
         <w:t xml:space="preserve"> </w:t>
       </w:r>
       <w:r>
-        <w:t xml:space="preserve">quando o maior número de dose registrado é igual ou superior ao número de doses exigido no calendário da faixa etária.</w:t>
+        <w:t xml:space="preserve">quando não há dose vencida.</w:t>
       </w:r>
     </w:p>
     <w:p>
@@ -6335,6 +6390,59 @@
               <w:jc w:val="left"/>
             </w:pPr>
             <w:r>
+              <w:t xml:space="preserve">GET</w:t>
+            </w:r>
+          </w:p>
+        </w:tc>
+        <w:tc>
+          <w:tcPr/>
+          <w:p>
+            <w:pPr>
+              <w:pStyle w:val="Compact"/>
+              <w:jc w:val="left"/>
+            </w:pPr>
+            <w:r>
+              <w:rPr>
+                <w:rStyle w:val="VerbatimChar"/>
+              </w:rPr>
+              <w:t xml:space="preserve">/pendencias/:pessoaId/proximas-doses</w:t>
+            </w:r>
+          </w:p>
+        </w:tc>
+        <w:tc>
+          <w:tcPr/>
+          <w:p>
+            <w:pPr>
+              <w:pStyle w:val="Compact"/>
+              <w:jc w:val="left"/>
+            </w:pPr>
+            <w:r>
+              <w:t xml:space="preserve">Autenticado + posse</w:t>
+            </w:r>
+          </w:p>
+        </w:tc>
+        <w:tc>
+          <w:tcPr/>
+          <w:p>
+            <w:pPr>
+              <w:pStyle w:val="Compact"/>
+              <w:jc w:val="left"/>
+            </w:pPr>
+            <w:r>
+              <w:t xml:space="preserve">Próxima dose de cada vacina, com data prevista e status.</w:t>
+            </w:r>
+          </w:p>
+        </w:tc>
+      </w:tr>
+      <w:tr>
+        <w:tc>
+          <w:tcPr/>
+          <w:p>
+            <w:pPr>
+              <w:pStyle w:val="Compact"/>
+              <w:jc w:val="left"/>
+            </w:pPr>
+            <w:r>
               <w:t xml:space="preserve">POST</w:t>
             </w:r>
           </w:p>
@@ -7833,13 +7941,13 @@
       </w:r>
     </w:p>
     <w:bookmarkEnd w:id="63"/>
-    <w:bookmarkStart w:id="64" w:name="cálculo-de-pendências"/>
+    <w:bookmarkStart w:id="64" w:name="Xe325d8b617735fcbf80b2f32d2ff2c01c1db06b"/>
     <w:p>
       <w:pPr>
         <w:pStyle w:val="Heading2"/>
       </w:pPr>
       <w:r>
-        <w:t xml:space="preserve">5.3 Cálculo de pendências</w:t>
+        <w:t xml:space="preserve">5.3 Cálculo de pendências e de próximas doses</w:t>
       </w:r>
     </w:p>
     <w:p>
@@ -7847,65 +7955,49 @@
         <w:pStyle w:val="FirstParagraph"/>
       </w:pPr>
       <w:r>
-        <w:t xml:space="preserve">O</w:t>
-      </w:r>
-      <w:r>
-        <w:t xml:space="preserve"> </w:t>
-      </w:r>
-      <w:r>
-        <w:rPr>
-          <w:rStyle w:val="VerbatimChar"/>
-        </w:rPr>
-        <w:t xml:space="preserve">VacinalService</w:t>
-      </w:r>
-      <w:r>
-        <w:t xml:space="preserve"> </w:t>
-      </w:r>
-      <w:r>
-        <w:t xml:space="preserve">concentra a regra central. Ele calcula a idade considerando mês e dia (evitando o erro comum de subtrair apenas os anos), obtém a faixa etária pela função pura</w:t>
-      </w:r>
-      <w:r>
-        <w:t xml:space="preserve"> </w:t>
-      </w:r>
-      <w:r>
-        <w:rPr>
-          <w:rStyle w:val="VerbatimChar"/>
-        </w:rPr>
-        <w:t xml:space="preserve">obterFaixaEtaria</w:t>
-      </w:r>
-      <w:r>
-        <w:t xml:space="preserve">, consulta o calendário correspondente e compara cada item com a carteira por meio do maior número de dose registrado. A escolha do</w:t>
-      </w:r>
-      <w:r>
-        <w:t xml:space="preserve"> </w:t>
-      </w:r>
-      <w:r>
-        <w:rPr>
-          <w:bCs/>
-          <w:b/>
-        </w:rPr>
-        <w:t xml:space="preserve">maior número de dose</w:t>
-      </w:r>
-      <w:r>
-        <w:t xml:space="preserve"> </w:t>
-      </w:r>
-      <w:r>
-        <w:t xml:space="preserve">em vez da contagem de linhas foi deliberada: uma pessoa que só possui a 3ª dose lançada na caderneta está com o esquema completo, ainda que as anteriores não estejam digitadas. O método</w:t>
-      </w:r>
-      <w:r>
-        <w:t xml:space="preserve"> </w:t>
-      </w:r>
-      <w:r>
-        <w:rPr>
-          <w:rStyle w:val="VerbatimChar"/>
-        </w:rPr>
-        <w:t xml:space="preserve">obterResumoPessoa</w:t>
-      </w:r>
-      <w:r>
-        <w:t xml:space="preserve"> </w:t>
-      </w:r>
-      <w:r>
-        <w:t xml:space="preserve">junta tudo em um único</w:t>
+        <w:t xml:space="preserve">A primeira versão do cálculo comparava apenas o</w:t>
+      </w:r>
+      <w:r>
+        <w:t xml:space="preserve"> </w:t>
+      </w:r>
+      <w:r>
+        <w:rPr>
+          <w:bCs/>
+          <w:b/>
+        </w:rPr>
+        <w:t xml:space="preserve">número de doses registradas</w:t>
+      </w:r>
+      <w:r>
+        <w:t xml:space="preserve"> </w:t>
+      </w:r>
+      <w:r>
+        <w:t xml:space="preserve">com o</w:t>
+      </w:r>
+      <w:r>
+        <w:t xml:space="preserve"> </w:t>
+      </w:r>
+      <w:r>
+        <w:rPr>
+          <w:bCs/>
+          <w:b/>
+        </w:rPr>
+        <w:t xml:space="preserve">número de doses da faixa etária</w:t>
+      </w:r>
+      <w:r>
+        <w:t xml:space="preserve">. A auditoria contra os calendários de 2026 (Apêndice C) mostrou que isso falhava em dois pontos: o calendário guardado no banco estava desatualizado e a lógica</w:t>
+      </w:r>
+      <w:r>
+        <w:t xml:space="preserve"> </w:t>
+      </w:r>
+      <w:r>
+        <w:rPr>
+          <w:bCs/>
+          <w:b/>
+        </w:rPr>
+        <w:t xml:space="preserve">ignorava o tempo</w:t>
+      </w:r>
+      <w:r>
+        <w:t xml:space="preserve">. Um bebê de três meses aparecia com pendência de varicela e de tríplice viral, doses que só vencem aos 12 e 15 meses; os intervalos entre doses, os reforços e os grupos especiais existiam no modelo de dados, mas nenhum código os lia; e o sistema dizia</w:t>
       </w:r>
       <w:r>
         <w:t xml:space="preserve"> </w:t>
@@ -7915,13 +8007,26 @@
           <w:iCs/>
           <w:i/>
         </w:rPr>
-        <w:t xml:space="preserve">payload</w:t>
-      </w:r>
-      <w:r>
-        <w:t xml:space="preserve"> </w:t>
-      </w:r>
-      <w:r>
-        <w:t xml:space="preserve">com os nomes das vacinas, de modo que a tela do painel faça apenas uma chamada.</w:t>
+        <w:t xml:space="preserve">que</w:t>
+      </w:r>
+      <w:r>
+        <w:t xml:space="preserve"> </w:t>
+      </w:r>
+      <w:r>
+        <w:t xml:space="preserve">faltava uma dose, não</w:t>
+      </w:r>
+      <w:r>
+        <w:t xml:space="preserve"> </w:t>
+      </w:r>
+      <w:r>
+        <w:rPr>
+          <w:iCs/>
+          <w:i/>
+        </w:rPr>
+        <w:t xml:space="preserve">quando</w:t>
+      </w:r>
+      <w:r>
+        <w:t xml:space="preserve">.</w:t>
       </w:r>
     </w:p>
     <w:p>
@@ -7929,7 +8034,298 @@
         <w:pStyle w:val="BodyText"/>
       </w:pPr>
       <w:r>
-        <w:t xml:space="preserve">Como o calendário e as regras estão em tabelas, a atualização de uma recomendação do PNI é uma alteração de dados e não de código, em consonância com o princípio aberto/fechado.</w:t>
+        <w:t xml:space="preserve">O cálculo atual é orientado a datas. O Calendário Nacional 2026 foi transcrito para</w:t>
+      </w:r>
+      <w:r>
+        <w:t xml:space="preserve"> </w:t>
+      </w:r>
+      <w:r>
+        <w:rPr>
+          <w:rStyle w:val="VerbatimChar"/>
+        </w:rPr>
+        <w:t xml:space="preserve">data/esquemaVacinal2026.ts</w:t>
+      </w:r>
+      <w:r>
+        <w:t xml:space="preserve">, em que cada linha é uma dose com a</w:t>
+      </w:r>
+      <w:r>
+        <w:t xml:space="preserve"> </w:t>
+      </w:r>
+      <w:r>
+        <w:rPr>
+          <w:bCs/>
+          <w:b/>
+        </w:rPr>
+        <w:t xml:space="preserve">idade recomendada</w:t>
+      </w:r>
+      <w:r>
+        <w:t xml:space="preserve"> </w:t>
+      </w:r>
+      <w:r>
+        <w:t xml:space="preserve">(em meses, contados do nascimento), o</w:t>
+      </w:r>
+      <w:r>
+        <w:t xml:space="preserve"> </w:t>
+      </w:r>
+      <w:r>
+        <w:rPr>
+          <w:bCs/>
+          <w:b/>
+        </w:rPr>
+        <w:t xml:space="preserve">intervalo mínimo</w:t>
+      </w:r>
+      <w:r>
+        <w:t xml:space="preserve"> </w:t>
+      </w:r>
+      <w:r>
+        <w:t xml:space="preserve">desde a dose anterior, a</w:t>
+      </w:r>
+      <w:r>
+        <w:t xml:space="preserve"> </w:t>
+      </w:r>
+      <w:r>
+        <w:rPr>
+          <w:bCs/>
+          <w:b/>
+        </w:rPr>
+        <w:t xml:space="preserve">janela de idade</w:t>
+      </w:r>
+      <w:r>
+        <w:t xml:space="preserve"> </w:t>
+      </w:r>
+      <w:r>
+        <w:t xml:space="preserve">em que ela é cobrada e o</w:t>
+      </w:r>
+      <w:r>
+        <w:t xml:space="preserve"> </w:t>
+      </w:r>
+      <w:r>
+        <w:rPr>
+          <w:bCs/>
+          <w:b/>
+        </w:rPr>
+        <w:t xml:space="preserve">grupo especial</w:t>
+      </w:r>
+      <w:r>
+        <w:t xml:space="preserve"> </w:t>
+      </w:r>
+      <w:r>
+        <w:t xml:space="preserve">a que se aplica, quando houver. A função pura</w:t>
+      </w:r>
+      <w:r>
+        <w:t xml:space="preserve"> </w:t>
+      </w:r>
+      <w:r>
+        <w:rPr>
+          <w:rStyle w:val="VerbatimChar"/>
+        </w:rPr>
+        <w:t xml:space="preserve">calcularProximasDoses</w:t>
+      </w:r>
+      <w:r>
+        <w:t xml:space="preserve"> </w:t>
+      </w:r>
+      <w:r>
+        <w:t xml:space="preserve">(</w:t>
+      </w:r>
+      <w:r>
+        <w:rPr>
+          <w:rStyle w:val="VerbatimChar"/>
+        </w:rPr>
+        <w:t xml:space="preserve">utils/proximasDoses.ts</w:t>
+      </w:r>
+      <w:r>
+        <w:t xml:space="preserve">) recebe a data de nascimento, as doses registradas com suas datas e os grupos da pessoa e, para cada vacina, determina a próxima dose não cumprida e a sua data prevista:</w:t>
+      </w:r>
+    </w:p>
+    <w:p>
+      <w:pPr>
+        <w:pStyle w:val="BlockText"/>
+      </w:pPr>
+      <w:r>
+        <w:t xml:space="preserve">data prevista =</w:t>
+      </w:r>
+      <w:r>
+        <w:t xml:space="preserve"> </w:t>
+      </w:r>
+      <w:r>
+        <w:rPr>
+          <w:bCs/>
+          <w:b/>
+        </w:rPr>
+        <w:t xml:space="preserve">maior</w:t>
+      </w:r>
+      <w:r>
+        <w:t xml:space="preserve"> </w:t>
+      </w:r>
+      <w:r>
+        <w:t xml:space="preserve">entre (nascimento + idade recomendada) e (data da última dose + intervalo mínimo)</w:t>
+      </w:r>
+    </w:p>
+    <w:p>
+      <w:pPr>
+        <w:pStyle w:val="FirstParagraph"/>
+      </w:pPr>
+      <w:r>
+        <w:t xml:space="preserve">Assim, a dose nunca é marcada antes do intervalo mínimo nem antes da idade recomendada: se a 1ª dose do rotavírus é aplicada com atraso, a 2ª é empurrada para 60 dias depois dela. Reforços periódicos (dT a cada 10 anos, influenza anual, COVID-19 semestral do idoso) usam</w:t>
+      </w:r>
+      <w:r>
+        <w:t xml:space="preserve"> </w:t>
+      </w:r>
+      <w:r>
+        <w:rPr>
+          <w:iCs/>
+          <w:i/>
+        </w:rPr>
+        <w:t xml:space="preserve">data da última dose + período</w:t>
+      </w:r>
+      <w:r>
+        <w:t xml:space="preserve">. Cada dose recebe um status:</w:t>
+      </w:r>
+      <w:r>
+        <w:t xml:space="preserve"> </w:t>
+      </w:r>
+      <w:r>
+        <w:rPr>
+          <w:rStyle w:val="VerbatimChar"/>
+        </w:rPr>
+        <w:t xml:space="preserve">ATRASADA</w:t>
+      </w:r>
+      <w:r>
+        <w:t xml:space="preserve">,</w:t>
+      </w:r>
+      <w:r>
+        <w:t xml:space="preserve"> </w:t>
+      </w:r>
+      <w:r>
+        <w:rPr>
+          <w:rStyle w:val="VerbatimChar"/>
+        </w:rPr>
+        <w:t xml:space="preserve">DISPONIVEL</w:t>
+      </w:r>
+      <w:r>
+        <w:t xml:space="preserve"> </w:t>
+      </w:r>
+      <w:r>
+        <w:t xml:space="preserve">(pode ser tomada agora, mas o calendário não define data, como na hepatite B de quem nunca se vacinou),</w:t>
+      </w:r>
+      <w:r>
+        <w:t xml:space="preserve"> </w:t>
+      </w:r>
+      <w:r>
+        <w:rPr>
+          <w:rStyle w:val="VerbatimChar"/>
+        </w:rPr>
+        <w:t xml:space="preserve">PROXIMA</w:t>
+      </w:r>
+      <w:r>
+        <w:t xml:space="preserve"> </w:t>
+      </w:r>
+      <w:r>
+        <w:t xml:space="preserve">(vence em até 30 dias) ou</w:t>
+      </w:r>
+      <w:r>
+        <w:t xml:space="preserve"> </w:t>
+      </w:r>
+      <w:r>
+        <w:rPr>
+          <w:rStyle w:val="VerbatimChar"/>
+        </w:rPr>
+        <w:t xml:space="preserve">FUTURA</w:t>
+      </w:r>
+      <w:r>
+        <w:t xml:space="preserve">. Doses que passaram da idade máxima (como o rotavírus, cuja janela se encerra aos 11 meses e 29 dias) deixam de ser cobradas. Duas equivalências são tratadas: a pentavalente conta como hepatite B, e qualquer vacina com componente tetânico (DTP, dTpa, penta) reinicia a contagem dos 10 anos do dT.</w:t>
+      </w:r>
+    </w:p>
+    <w:p>
+      <w:pPr>
+        <w:pStyle w:val="BodyText"/>
+      </w:pPr>
+      <w:r>
+        <w:t xml:space="preserve">A aritmética de datas é feita em UTC e soma meses sem estourar o fim do mês (31/01 mais um mês é 28/02 ou 29/02), para que o fuso do servidor e a duração dos meses não desloquem o dia. O</w:t>
+      </w:r>
+      <w:r>
+        <w:t xml:space="preserve"> </w:t>
+      </w:r>
+      <w:r>
+        <w:rPr>
+          <w:rStyle w:val="VerbatimChar"/>
+        </w:rPr>
+        <w:t xml:space="preserve">VacinalService</w:t>
+      </w:r>
+      <w:r>
+        <w:t xml:space="preserve"> </w:t>
+      </w:r>
+      <w:r>
+        <w:t xml:space="preserve">usa esse resultado para montar o resumo do</w:t>
+      </w:r>
+      <w:r>
+        <w:t xml:space="preserve"> </w:t>
+      </w:r>
+      <w:r>
+        <w:rPr>
+          <w:iCs/>
+          <w:i/>
+        </w:rPr>
+        <w:t xml:space="preserve">Dashboard</w:t>
+      </w:r>
+      <w:r>
+        <w:t xml:space="preserve">: as doses</w:t>
+      </w:r>
+      <w:r>
+        <w:t xml:space="preserve"> </w:t>
+      </w:r>
+      <w:r>
+        <w:rPr>
+          <w:rStyle w:val="VerbatimChar"/>
+        </w:rPr>
+        <w:t xml:space="preserve">ATRASADA</w:t>
+      </w:r>
+      <w:r>
+        <w:t xml:space="preserve"> </w:t>
+      </w:r>
+      <w:r>
+        <w:t xml:space="preserve">e</w:t>
+      </w:r>
+      <w:r>
+        <w:t xml:space="preserve"> </w:t>
+      </w:r>
+      <w:r>
+        <w:rPr>
+          <w:rStyle w:val="VerbatimChar"/>
+        </w:rPr>
+        <w:t xml:space="preserve">DISPONIVEL</w:t>
+      </w:r>
+      <w:r>
+        <w:t xml:space="preserve"> </w:t>
+      </w:r>
+      <w:r>
+        <w:t xml:space="preserve">são as pendências, e as demais compõem a lista de</w:t>
+      </w:r>
+      <w:r>
+        <w:t xml:space="preserve"> </w:t>
+      </w:r>
+      <w:r>
+        <w:t xml:space="preserve">“</w:t>
+      </w:r>
+      <w:r>
+        <w:t xml:space="preserve">próximas doses</w:t>
+      </w:r>
+      <w:r>
+        <w:t xml:space="preserve">”</w:t>
+      </w:r>
+      <w:r>
+        <w:t xml:space="preserve"> </w:t>
+      </w:r>
+      <w:r>
+        <w:t xml:space="preserve">com data. O teste de integração com banco em memória confere esse caminho de ponta a ponta.</w:t>
+      </w:r>
+    </w:p>
+    <w:p>
+      <w:pPr>
+        <w:pStyle w:val="BodyText"/>
+      </w:pPr>
+      <w:r>
+        <w:t xml:space="preserve">Essa abordagem tem um custo: o calendário passa a viver em um arquivo versionado, e não em tabelas editáveis pelo administrador, o que simplifica o cálculo e o torna testável, mas exige uma nova versão do sistema a cada atualização anual do calendário. Mover o esquema de volta para o banco, com edição e histórico de versões, é uma melhoria futura.</w:t>
       </w:r>
     </w:p>
     <w:bookmarkEnd w:id="64"/>
@@ -10282,41 +10678,28 @@
           <w:bCs/>
           <w:b/>
         </w:rPr>
-        <w:t xml:space="preserve">Calendário simplificado.</w:t>
-      </w:r>
-      <w:r>
-        <w:t xml:space="preserve"> </w:t>
-      </w:r>
-      <w:r>
-        <w:t xml:space="preserve">As pendências são calculadas por faixa etária e número de doses. Não consideram ainda</w:t>
-      </w:r>
-      <w:r>
-        <w:t xml:space="preserve"> </w:t>
-      </w:r>
-      <w:r>
-        <w:rPr>
-          <w:bCs/>
-          <w:b/>
-        </w:rPr>
-        <w:t xml:space="preserve">intervalos mínimos entre doses</w:t>
-      </w:r>
-      <w:r>
-        <w:t xml:space="preserve">, idade mínima de cada dose, esquemas de recuperação, contraindicações, nem calendário específico completo por grupo especial. Por exemplo, uma criança de 5 anos e uma de 6 meses pertencem à mesma faixa</w:t>
-      </w:r>
-      <w:r>
-        <w:t xml:space="preserve"> </w:t>
-      </w:r>
-      <w:r>
-        <w:t xml:space="preserve">“</w:t>
-      </w:r>
-      <w:r>
-        <w:t xml:space="preserve">criança</w:t>
-      </w:r>
-      <w:r>
-        <w:t xml:space="preserve">”</w:t>
-      </w:r>
-      <w:r>
-        <w:t xml:space="preserve">.</w:t>
+        <w:t xml:space="preserve">Cobertura do calendário.</w:t>
+      </w:r>
+      <w:r>
+        <w:t xml:space="preserve"> </w:t>
+      </w:r>
+      <w:r>
+        <w:t xml:space="preserve">O cálculo usa o Calendário Nacional 2026 (idade, intervalo e grupo especial), mas não modela gestantes (o calendário próprio não foi incluído), imunocomprometidos, acamados, viajantes e áreas de risco, que dependem de avaliação do serviço de saúde. Onde o calendário não informa o intervalo entre doses (hepatite B e dengue), foram mantidos os valores que o sistema já utilizava. A tabela</w:t>
+      </w:r>
+      <w:r>
+        <w:t xml:space="preserve"> </w:t>
+      </w:r>
+      <w:r>
+        <w:rPr>
+          <w:rStyle w:val="VerbatimChar"/>
+        </w:rPr>
+        <w:t xml:space="preserve">calendario_vacinal</w:t>
+      </w:r>
+      <w:r>
+        <w:t xml:space="preserve"> </w:t>
+      </w:r>
+      <w:r>
+        <w:t xml:space="preserve">antiga, hoje fora do cálculo do painel, ainda precisa ser atualizada ou aposentada.</w:t>
       </w:r>
     </w:p>
     <w:p>
@@ -12599,6 +12982,150 @@
       </w:r>
     </w:p>
     <w:bookmarkEnd w:id="86"/>
+    <w:bookmarkStart w:id="87" w:name="X6a4a83357906146c7716041a7a8475ca5c30b9e"/>
+    <w:p>
+      <w:pPr>
+        <w:pStyle w:val="Heading1"/>
+      </w:pPr>
+      <w:r>
+        <w:t xml:space="preserve">APÊNDICE C — AUDITORIA DO CALENDÁRIO VACINAL</w:t>
+      </w:r>
+    </w:p>
+    <w:p>
+      <w:pPr>
+        <w:pStyle w:val="FirstParagraph"/>
+      </w:pPr>
+      <w:r>
+        <w:t xml:space="preserve">Comparação entre o que o sistema guardava (</w:t>
+      </w:r>
+      <w:r>
+        <w:rPr>
+          <w:rStyle w:val="VerbatimChar"/>
+        </w:rPr>
+        <w:t xml:space="preserve">calendarioSeed.ts</w:t>
+      </w:r>
+      <w:r>
+        <w:t xml:space="preserve">,</w:t>
+      </w:r>
+      <w:r>
+        <w:t xml:space="preserve"> </w:t>
+      </w:r>
+      <w:r>
+        <w:rPr>
+          <w:rStyle w:val="VerbatimChar"/>
+        </w:rPr>
+        <w:t xml:space="preserve">regrasSeed.ts</w:t>
+      </w:r>
+      <w:r>
+        <w:t xml:space="preserve">,</w:t>
+      </w:r>
+      <w:r>
+        <w:t xml:space="preserve"> </w:t>
+      </w:r>
+      <w:r>
+        <w:rPr>
+          <w:rStyle w:val="VerbatimChar"/>
+        </w:rPr>
+        <w:t xml:space="preserve">faixaEtaria.ts</w:t>
+      </w:r>
+      <w:r>
+        <w:t xml:space="preserve"> </w:t>
+      </w:r>
+      <w:r>
+        <w:t xml:space="preserve">e</w:t>
+      </w:r>
+      <w:r>
+        <w:t xml:space="preserve"> </w:t>
+      </w:r>
+      <w:r>
+        <w:rPr>
+          <w:rStyle w:val="VerbatimChar"/>
+        </w:rPr>
+        <w:t xml:space="preserve">VacinalService</w:t>
+      </w:r>
+      <w:r>
+        <w:t xml:space="preserve">) e os quatro calendários do Ministério da Saúde de 2026. O texto completo, com a tabela de divergências por vacina, está em</w:t>
+      </w:r>
+      <w:r>
+        <w:t xml:space="preserve"> </w:t>
+      </w:r>
+      <w:r>
+        <w:rPr>
+          <w:rStyle w:val="VerbatimChar"/>
+        </w:rPr>
+        <w:t xml:space="preserve">docs/auditoria-calendario-2026.md</w:t>
+      </w:r>
+      <w:r>
+        <w:t xml:space="preserve">.</w:t>
+      </w:r>
+    </w:p>
+    <w:p>
+      <w:pPr>
+        <w:numPr>
+          <w:ilvl w:val="0"/>
+          <w:numId w:val="1010"/>
+        </w:numPr>
+        <w:pStyle w:val="Compact"/>
+      </w:pPr>
+      <w:r>
+        <w:rPr>
+          <w:bCs/>
+          <w:b/>
+        </w:rPr>
+        <w:t xml:space="preserve">Dados:</w:t>
+      </w:r>
+      <w:r>
+        <w:t xml:space="preserve"> </w:t>
+      </w:r>
+      <w:r>
+        <w:t xml:space="preserve">20 divergências, entre elas: hepatite B da criança com 3 doses (o calendário traz 1 dose ao nascer); poliomielite sem os reforços aos 15 meses e 4 anos; tríplice viral, febre amarela e varicela da criança com número de doses a menos; HPV com 2 doses (o calendário traz 1 dose, aos 9 anos); influenza, COVID-19 e dengue ausentes do calendário; pneumocócica 23-valente no idoso (o calendário traz a 20-valente, para grupos específicos).</w:t>
+      </w:r>
+    </w:p>
+    <w:p>
+      <w:pPr>
+        <w:numPr>
+          <w:ilvl w:val="0"/>
+          <w:numId w:val="1010"/>
+        </w:numPr>
+        <w:pStyle w:val="Compact"/>
+      </w:pPr>
+      <w:r>
+        <w:rPr>
+          <w:bCs/>
+          <w:b/>
+        </w:rPr>
+        <w:t xml:space="preserve">Lógica:</w:t>
+      </w:r>
+      <w:r>
+        <w:t xml:space="preserve"> </w:t>
+      </w:r>
+      <w:r>
+        <w:t xml:space="preserve">faixas etárias com limites diferentes (criança 0–10, e não 0–9; adulto a partir dos 20, e não dos 25); pendências sem considerar a idade em que cada dose é devida; reforços, intervalos e grupos especiais gravados, mas nunca lidos; nenhuma data prevista.</w:t>
+      </w:r>
+    </w:p>
+    <w:p>
+      <w:pPr>
+        <w:numPr>
+          <w:ilvl w:val="0"/>
+          <w:numId w:val="1010"/>
+        </w:numPr>
+        <w:pStyle w:val="Compact"/>
+      </w:pPr>
+      <w:r>
+        <w:rPr>
+          <w:bCs/>
+          <w:b/>
+        </w:rPr>
+        <w:t xml:space="preserve">Correção:</w:t>
+      </w:r>
+      <w:r>
+        <w:t xml:space="preserve"> </w:t>
+      </w:r>
+      <w:r>
+        <w:t xml:space="preserve">o cálculo de próximas doses (Seção 5.3) e a revisão dos limites das faixas etárias.</w:t>
+      </w:r>
+    </w:p>
+    <w:bookmarkEnd w:id="87"/>
     <w:sectPr/>
   </w:body>
 </w:document>
@@ -13114,6 +13641,9 @@
     </w:lvlOverride>
   </w:num>
   <w:num w:numId="1009">
+    <w:abstractNumId w:val="991"/>
+  </w:num>
+  <w:num w:numId="1010">
     <w:abstractNumId w:val="991"/>
   </w:num>
 </w:numbering>

</xml_diff>

<commit_message>
Atualiza o calendario_vacinal para 2026 e avisa por e-mail so quando a dose esta chegando
- calendario_vacinal: linhas das faixas etarias derivadas do mesmo esquema
  do calculo de datas; versao registrada em configuracoes e troca unica
  quando muda (grupo GESTANTE preservado)
- Aviso de dose: deixa de ser e-mail diario de pendencias; envia uma vez por
  dose quando faltam ate 7 dias (AVISO_DOSE_DIAS), com o periodo da campanha;
  tabela avisos_dose impede repeticao e o registro e desfeito se o envio falhar
- Calendario da pessoa: marca a data prevista de cada dose e o periodo da
  campanha da vacina
- Testes e documentacao atualizados
</commit_message>
<xml_diff>
--- a/docs/monografia/Monografia-NotificaVacinas.docx
+++ b/docs/monografia/Monografia-NotificaVacinas.docx
@@ -4711,7 +4711,7 @@
         <w:pStyle w:val="FirstParagraph"/>
       </w:pPr>
       <w:r>
-        <w:t xml:space="preserve">O modelo relacional possui catorze tabelas.</w:t>
+        <w:t xml:space="preserve">O modelo relacional possui dezesseis tabelas.</w:t>
       </w:r>
     </w:p>
     <w:tbl>
@@ -5509,6 +5509,100 @@
             </w:r>
             <w:r>
               <w:t xml:space="preserve">.</w:t>
+            </w:r>
+          </w:p>
+        </w:tc>
+      </w:tr>
+      <w:tr>
+        <w:tc>
+          <w:tcPr/>
+          <w:p>
+            <w:pPr>
+              <w:pStyle w:val="Compact"/>
+              <w:jc w:val="left"/>
+            </w:pPr>
+            <w:r>
+              <w:rPr>
+                <w:rStyle w:val="VerbatimChar"/>
+              </w:rPr>
+              <w:t xml:space="preserve">avisos_dose</w:t>
+            </w:r>
+          </w:p>
+        </w:tc>
+        <w:tc>
+          <w:tcPr/>
+          <w:p>
+            <w:pPr>
+              <w:pStyle w:val="Compact"/>
+              <w:jc w:val="left"/>
+            </w:pPr>
+            <w:r>
+              <w:t xml:space="preserve">Registro de cada aviso de dose já enviado (pessoa, vacina, nº da dose e data prevista, com chave única), para avisar uma vez só.</w:t>
+            </w:r>
+          </w:p>
+        </w:tc>
+        <w:tc>
+          <w:tcPr/>
+          <w:p>
+            <w:pPr>
+              <w:pStyle w:val="Compact"/>
+              <w:jc w:val="left"/>
+            </w:pPr>
+            <w:r>
+              <w:t xml:space="preserve">N:1 com</w:t>
+            </w:r>
+            <w:r>
+              <w:t xml:space="preserve"> </w:t>
+            </w:r>
+            <w:r>
+              <w:rPr>
+                <w:rStyle w:val="VerbatimChar"/>
+              </w:rPr>
+              <w:t xml:space="preserve">pessoas</w:t>
+            </w:r>
+            <w:r>
+              <w:t xml:space="preserve">.</w:t>
+            </w:r>
+          </w:p>
+        </w:tc>
+      </w:tr>
+      <w:tr>
+        <w:tc>
+          <w:tcPr/>
+          <w:p>
+            <w:pPr>
+              <w:pStyle w:val="Compact"/>
+              <w:jc w:val="left"/>
+            </w:pPr>
+            <w:r>
+              <w:rPr>
+                <w:rStyle w:val="VerbatimChar"/>
+              </w:rPr>
+              <w:t xml:space="preserve">configuracoes</w:t>
+            </w:r>
+          </w:p>
+        </w:tc>
+        <w:tc>
+          <w:tcPr/>
+          <w:p>
+            <w:pPr>
+              <w:pStyle w:val="Compact"/>
+              <w:jc w:val="left"/>
+            </w:pPr>
+            <w:r>
+              <w:t xml:space="preserve">Pares chave/valor; guarda a versão do calendário carregada no banco.</w:t>
+            </w:r>
+          </w:p>
+        </w:tc>
+        <w:tc>
+          <w:tcPr/>
+          <w:p>
+            <w:pPr>
+              <w:pStyle w:val="Compact"/>
+              <w:jc w:val="left"/>
+            </w:pPr>
+            <w:r>
+              <w:t xml:space="preserve">—</w:t>
             </w:r>
           </w:p>
         </w:tc>
@@ -8325,6 +8419,103 @@
         <w:pStyle w:val="BodyText"/>
       </w:pPr>
       <w:r>
+        <w:t xml:space="preserve">A tabela</w:t>
+      </w:r>
+      <w:r>
+        <w:t xml:space="preserve"> </w:t>
+      </w:r>
+      <w:r>
+        <w:rPr>
+          <w:rStyle w:val="VerbatimChar"/>
+        </w:rPr>
+        <w:t xml:space="preserve">calendario_vacinal</w:t>
+      </w:r>
+      <w:r>
+        <w:t xml:space="preserve">, usada pela rota</w:t>
+      </w:r>
+      <w:r>
+        <w:t xml:space="preserve"> </w:t>
+      </w:r>
+      <w:r>
+        <w:rPr>
+          <w:rStyle w:val="VerbatimChar"/>
+        </w:rPr>
+        <w:t xml:space="preserve">/calendario</w:t>
+      </w:r>
+      <w:r>
+        <w:t xml:space="preserve">, deixou de ser digitada à parte: suas linhas por faixa etária (criança, adolescente, adulto e idoso) são</w:t>
+      </w:r>
+      <w:r>
+        <w:t xml:space="preserve"> </w:t>
+      </w:r>
+      <w:r>
+        <w:rPr>
+          <w:bCs/>
+          <w:b/>
+        </w:rPr>
+        <w:t xml:space="preserve">derivadas do mesmo esquema</w:t>
+      </w:r>
+      <w:r>
+        <w:t xml:space="preserve"> </w:t>
+      </w:r>
+      <w:r>
+        <w:t xml:space="preserve">(</w:t>
+      </w:r>
+      <w:r>
+        <w:rPr>
+          <w:rStyle w:val="VerbatimChar"/>
+        </w:rPr>
+        <w:t xml:space="preserve">utils/calendarioDerivado.ts</w:t>
+      </w:r>
+      <w:r>
+        <w:t xml:space="preserve">), de modo que atualizar o calendário em um único arquivo atualiza o cálculo das datas e a tabela. Uma versão do calendário (</w:t>
+      </w:r>
+      <w:r>
+        <w:t xml:space="preserve">“</w:t>
+      </w:r>
+      <w:r>
+        <w:t xml:space="preserve">2026</w:t>
+      </w:r>
+      <w:r>
+        <w:t xml:space="preserve">”</w:t>
+      </w:r>
+      <w:r>
+        <w:t xml:space="preserve">) fica registrada na tabela</w:t>
+      </w:r>
+      <w:r>
+        <w:t xml:space="preserve"> </w:t>
+      </w:r>
+      <w:r>
+        <w:rPr>
+          <w:rStyle w:val="VerbatimChar"/>
+        </w:rPr>
+        <w:t xml:space="preserve">configuracoes</w:t>
+      </w:r>
+      <w:r>
+        <w:t xml:space="preserve">; quando ela difere da versão do código, o</w:t>
+      </w:r>
+      <w:r>
+        <w:t xml:space="preserve"> </w:t>
+      </w:r>
+      <w:r>
+        <w:rPr>
+          <w:iCs/>
+          <w:i/>
+        </w:rPr>
+        <w:t xml:space="preserve">seed</w:t>
+      </w:r>
+      <w:r>
+        <w:t xml:space="preserve"> </w:t>
+      </w:r>
+      <w:r>
+        <w:t xml:space="preserve">substitui as linhas dessas faixas, uma única vez, sem tocar nas linhas de grupos especiais. O custo é que edições manuais do administrador nessas linhas são substituídas na troca de versão.</w:t>
+      </w:r>
+    </w:p>
+    <w:p>
+      <w:pPr>
+        <w:pStyle w:val="BodyText"/>
+      </w:pPr>
+      <w:r>
         <w:t xml:space="preserve">Essa abordagem tem um custo: o calendário passa a viver em um arquivo versionado, e não em tabelas editáveis pelo administrador, o que simplifica o cálculo e o torna testável, mas exige uma nova versão do sistema a cada atualização anual do calendário. Mover o esquema de volta para o banco, com edição e histórico de versões, é uma melhoria futura.</w:t>
       </w:r>
     </w:p>
@@ -8846,7 +9037,7 @@
     <w:tbl>
       <w:tblPr>
         <w:tblStyle w:val="Table"/>
-        <w:tblW w:type="auto" w:w="0"/>
+        <w:tblW w:type="pct" w:w="5000"/>
         <w:tblLook w:firstRow="1" w:lastRow="0" w:firstColumn="0" w:lastColumn="0" w:noHBand="0" w:noVBand="0" w:val="0020"/>
         <w:jc w:val="start"/>
       </w:tblPr>
@@ -8981,19 +9172,19 @@
               <w:jc w:val="left"/>
             </w:pPr>
             <w:r>
-              <w:t xml:space="preserve">Alerta de pendências</w:t>
-            </w:r>
-          </w:p>
-        </w:tc>
-        <w:tc>
-          <w:tcPr/>
-          <w:p>
-            <w:pPr>
-              <w:pStyle w:val="Compact"/>
-              <w:jc w:val="left"/>
-            </w:pPr>
-            <w:r>
-              <w:t xml:space="preserve">Rotina diária</w:t>
+              <w:t xml:space="preserve">Dose chegando</w:t>
+            </w:r>
+          </w:p>
+        </w:tc>
+        <w:tc>
+          <w:tcPr/>
+          <w:p>
+            <w:pPr>
+              <w:pStyle w:val="Compact"/>
+              <w:jc w:val="left"/>
+            </w:pPr>
+            <w:r>
+              <w:t xml:space="preserve">Verificação diária; o e-mail sai uma única vez por dose, quando faltam até 7 dias para a data prevista</w:t>
             </w:r>
           </w:p>
         </w:tc>
@@ -9108,6 +9299,113 @@
       </w:r>
       <w:r>
         <w:t xml:space="preserve">, sem derrubar o processo (RNF09). O módulo de SMS existe como ponto de extensão, ainda sem provedor.</w:t>
+      </w:r>
+    </w:p>
+    <w:p>
+      <w:pPr>
+        <w:pStyle w:val="BodyText"/>
+      </w:pPr>
+      <w:r>
+        <w:rPr>
+          <w:bCs/>
+          <w:b/>
+        </w:rPr>
+        <w:t xml:space="preserve">Aviso de dose próxima.</w:t>
+      </w:r>
+      <w:r>
+        <w:t xml:space="preserve"> </w:t>
+      </w:r>
+      <w:r>
+        <w:t xml:space="preserve">O aviso por e-mail das pendências, que antes era enviado todos os dias enquanto houvesse uma vacina em atraso, foi substituído por um aviso</w:t>
+      </w:r>
+      <w:r>
+        <w:t xml:space="preserve"> </w:t>
+      </w:r>
+      <w:r>
+        <w:rPr>
+          <w:bCs/>
+          <w:b/>
+        </w:rPr>
+        <w:t xml:space="preserve">orientado à data</w:t>
+      </w:r>
+      <w:r>
+        <w:t xml:space="preserve">: a verificação diária calcula as próximas doses de cada pessoa e só envia e-mail quando uma dose entra na janela de 7 dias antes da data prevista (configurável por</w:t>
+      </w:r>
+      <w:r>
+        <w:t xml:space="preserve"> </w:t>
+      </w:r>
+      <w:r>
+        <w:rPr>
+          <w:rStyle w:val="VerbatimChar"/>
+        </w:rPr>
+        <w:t xml:space="preserve">AVISO_DOSE_DIAS</w:t>
+      </w:r>
+      <w:r>
+        <w:t xml:space="preserve">). A tabela</w:t>
+      </w:r>
+      <w:r>
+        <w:t xml:space="preserve"> </w:t>
+      </w:r>
+      <w:r>
+        <w:rPr>
+          <w:rStyle w:val="VerbatimChar"/>
+        </w:rPr>
+        <w:t xml:space="preserve">avisos_dose</w:t>
+      </w:r>
+      <w:r>
+        <w:t xml:space="preserve">, com chave única por pessoa, vacina, número da dose e data prevista, funciona como trava de idempotência: o</w:t>
+      </w:r>
+      <w:r>
+        <w:t xml:space="preserve"> </w:t>
+      </w:r>
+      <w:r>
+        <w:rPr>
+          <w:rStyle w:val="VerbatimChar"/>
+        </w:rPr>
+        <w:t xml:space="preserve">INSERT OR IGNORE</w:t>
+      </w:r>
+      <w:r>
+        <w:t xml:space="preserve"> </w:t>
+      </w:r>
+      <w:r>
+        <w:t xml:space="preserve">indica se é a primeira vez, de modo que a verificação pode rodar todos os dias, ou até duas vezes ao mesmo tempo, sem duplicar o e-mail. Se o envio falhar, o registro é desfeito e a dose é avisada de novo na verificação seguinte. Doses atrasadas ou sem data definida aparecem no painel e no calendário, sem e-mail diário. Quando a vacina tem campanha cadastrada, o e-mail informa o período dela.</w:t>
+      </w:r>
+    </w:p>
+    <w:p>
+      <w:pPr>
+        <w:pStyle w:val="BodyText"/>
+      </w:pPr>
+      <w:r>
+        <w:t xml:space="preserve">No calendário da pessoa (tela</w:t>
+      </w:r>
+      <w:r>
+        <w:t xml:space="preserve"> </w:t>
+      </w:r>
+      <w:r>
+        <w:rPr>
+          <w:iCs/>
+          <w:i/>
+        </w:rPr>
+        <w:t xml:space="preserve">Calendário</w:t>
+      </w:r>
+      <w:r>
+        <w:t xml:space="preserve">), a data prevista de cada dose do calendário nacional é marcada no dia (vermelho se atrasada, amarelo nos próximos 30 dias, azul adiante), e o</w:t>
+      </w:r>
+      <w:r>
+        <w:t xml:space="preserve"> </w:t>
+      </w:r>
+      <w:r>
+        <w:rPr>
+          <w:bCs/>
+          <w:b/>
+        </w:rPr>
+        <w:t xml:space="preserve">período da campanha</w:t>
+      </w:r>
+      <w:r>
+        <w:t xml:space="preserve"> </w:t>
+      </w:r>
+      <w:r>
+        <w:t xml:space="preserve">da vacina é marcado nos dias que ele abrange.</w:t>
       </w:r>
     </w:p>
     <w:p>
@@ -10684,22 +10982,7 @@
         <w:t xml:space="preserve"> </w:t>
       </w:r>
       <w:r>
-        <w:t xml:space="preserve">O cálculo usa o Calendário Nacional 2026 (idade, intervalo e grupo especial), mas não modela gestantes (o calendário próprio não foi incluído), imunocomprometidos, acamados, viajantes e áreas de risco, que dependem de avaliação do serviço de saúde. Onde o calendário não informa o intervalo entre doses (hepatite B e dengue), foram mantidos os valores que o sistema já utilizava. A tabela</w:t>
-      </w:r>
-      <w:r>
-        <w:t xml:space="preserve"> </w:t>
-      </w:r>
-      <w:r>
-        <w:rPr>
-          <w:rStyle w:val="VerbatimChar"/>
-        </w:rPr>
-        <w:t xml:space="preserve">calendario_vacinal</w:t>
-      </w:r>
-      <w:r>
-        <w:t xml:space="preserve"> </w:t>
-      </w:r>
-      <w:r>
-        <w:t xml:space="preserve">antiga, hoje fora do cálculo do painel, ainda precisa ser atualizada ou aposentada.</w:t>
+        <w:t xml:space="preserve">O cálculo usa o Calendário Nacional 2026 (idade, intervalo e grupo especial), mas não modela gestantes (o calendário próprio não foi incluído), imunocomprometidos, acamados, viajantes e áreas de risco, que dependem de avaliação do serviço de saúde. Onde o calendário não informa o intervalo entre doses (hepatite B e dengue), foram mantidos os valores que o sistema já utilizava.</w:t>
       </w:r>
     </w:p>
     <w:p>

</xml_diff>

<commit_message>
Permite escolher a frequencia dos avisos de vacina (uma vez, diaria, semanal, mensal ou desativada)
- Nova preferencia por pessoa (frequencia_aviso) com migracao e validacao
- Frequencias diaria/semanal/mensal enviam um resumo (atrasadas, disponiveis e
  as dos proximos 30 dias) no maximo uma vez por periodo; ultimo_resumo_em so
  e gravado se o e-mail saiu
- Tela Meu Perfil > Notificacoes para escolher
- Testes e documentacao atualizados
</commit_message>
<xml_diff>
--- a/docs/monografia/Monografia-NotificaVacinas.docx
+++ b/docs/monografia/Monografia-NotificaVacinas.docx
@@ -4860,7 +4860,7 @@
               <w:jc w:val="left"/>
             </w:pPr>
             <w:r>
-              <w:t xml:space="preserve">Titular ou dependente: nome, e-mail, telefone, data de nascimento, endereço, preferência de e-mail.</w:t>
+              <w:t xml:space="preserve">Titular ou dependente: nome, e-mail, telefone, data de nascimento, endereço, preferência de e-mail e frequência dos avisos de vacina.</w:t>
             </w:r>
           </w:p>
         </w:tc>
@@ -9184,7 +9184,7 @@
               <w:jc w:val="left"/>
             </w:pPr>
             <w:r>
-              <w:t xml:space="preserve">Verificação diária; o e-mail sai uma única vez por dose, quando faltam até 7 dias para a data prevista</w:t>
+              <w:t xml:space="preserve">Verificação diária; conforme a frequência escolhida: uma vez por dose (até 7 dias antes da data prevista), ou resumo diário, semanal ou mensal</w:t>
             </w:r>
           </w:p>
         </w:tc>
@@ -9369,6 +9369,158 @@
       </w:r>
       <w:r>
         <w:t xml:space="preserve">indica se é a primeira vez, de modo que a verificação pode rodar todos os dias, ou até duas vezes ao mesmo tempo, sem duplicar o e-mail. Se o envio falhar, o registro é desfeito e a dose é avisada de novo na verificação seguinte. Doses atrasadas ou sem data definida aparecem no painel e no calendário, sem e-mail diário. Quando a vacina tem campanha cadastrada, o e-mail informa o período dela.</w:t>
+      </w:r>
+    </w:p>
+    <w:p>
+      <w:pPr>
+        <w:pStyle w:val="BodyText"/>
+      </w:pPr>
+      <w:r>
+        <w:rPr>
+          <w:bCs/>
+          <w:b/>
+        </w:rPr>
+        <w:t xml:space="preserve">Frequência escolhida pela pessoa.</w:t>
+      </w:r>
+      <w:r>
+        <w:t xml:space="preserve"> </w:t>
+      </w:r>
+      <w:r>
+        <w:t xml:space="preserve">O ritmo dos avisos é uma preferência de cada pessoa (tela</w:t>
+      </w:r>
+      <w:r>
+        <w:t xml:space="preserve"> </w:t>
+      </w:r>
+      <w:r>
+        <w:rPr>
+          <w:iCs/>
+          <w:i/>
+        </w:rPr>
+        <w:t xml:space="preserve">Meu Perfil</w:t>
+      </w:r>
+      <w:r>
+        <w:t xml:space="preserve">, seção</w:t>
+      </w:r>
+      <w:r>
+        <w:t xml:space="preserve"> </w:t>
+      </w:r>
+      <w:r>
+        <w:rPr>
+          <w:iCs/>
+          <w:i/>
+        </w:rPr>
+        <w:t xml:space="preserve">Notificações</w:t>
+      </w:r>
+      <w:r>
+        <w:t xml:space="preserve">), com cinco opções:</w:t>
+      </w:r>
+      <w:r>
+        <w:t xml:space="preserve"> </w:t>
+      </w:r>
+      <w:r>
+        <w:rPr>
+          <w:iCs/>
+          <w:i/>
+        </w:rPr>
+        <w:t xml:space="preserve">uma vez</w:t>
+      </w:r>
+      <w:r>
+        <w:t xml:space="preserve"> </w:t>
+      </w:r>
+      <w:r>
+        <w:t xml:space="preserve">(padrão, o aviso por dose descrito acima),</w:t>
+      </w:r>
+      <w:r>
+        <w:t xml:space="preserve"> </w:t>
+      </w:r>
+      <w:r>
+        <w:rPr>
+          <w:iCs/>
+          <w:i/>
+        </w:rPr>
+        <w:t xml:space="preserve">diariamente</w:t>
+      </w:r>
+      <w:r>
+        <w:t xml:space="preserve">,</w:t>
+      </w:r>
+      <w:r>
+        <w:t xml:space="preserve"> </w:t>
+      </w:r>
+      <w:r>
+        <w:rPr>
+          <w:iCs/>
+          <w:i/>
+        </w:rPr>
+        <w:t xml:space="preserve">semanalmente</w:t>
+      </w:r>
+      <w:r>
+        <w:t xml:space="preserve">,</w:t>
+      </w:r>
+      <w:r>
+        <w:t xml:space="preserve"> </w:t>
+      </w:r>
+      <w:r>
+        <w:rPr>
+          <w:iCs/>
+          <w:i/>
+        </w:rPr>
+        <w:t xml:space="preserve">mensalmente</w:t>
+      </w:r>
+      <w:r>
+        <w:t xml:space="preserve"> </w:t>
+      </w:r>
+      <w:r>
+        <w:t xml:space="preserve">e</w:t>
+      </w:r>
+      <w:r>
+        <w:t xml:space="preserve"> </w:t>
+      </w:r>
+      <w:r>
+        <w:rPr>
+          <w:iCs/>
+          <w:i/>
+        </w:rPr>
+        <w:t xml:space="preserve">desativado</w:t>
+      </w:r>
+      <w:r>
+        <w:t xml:space="preserve">. Nas três opções periódicas o sistema envia um</w:t>
+      </w:r>
+      <w:r>
+        <w:t xml:space="preserve"> </w:t>
+      </w:r>
+      <w:r>
+        <w:rPr>
+          <w:bCs/>
+          <w:b/>
+        </w:rPr>
+        <w:t xml:space="preserve">resumo</w:t>
+      </w:r>
+      <w:r>
+        <w:t xml:space="preserve"> </w:t>
+      </w:r>
+      <w:r>
+        <w:t xml:space="preserve">(doses atrasadas, disponíveis e as que chegam em até 30 dias), no máximo uma vez por período: a decisão de enviar é uma função pura (</w:t>
+      </w:r>
+      <w:r>
+        <w:rPr>
+          <w:rStyle w:val="VerbatimChar"/>
+        </w:rPr>
+        <w:t xml:space="preserve">utils/frequenciaAviso.ts</w:t>
+      </w:r>
+      <w:r>
+        <w:t xml:space="preserve">) que compara a data do último resumo (coluna</w:t>
+      </w:r>
+      <w:r>
+        <w:t xml:space="preserve"> </w:t>
+      </w:r>
+      <w:r>
+        <w:rPr>
+          <w:rStyle w:val="VerbatimChar"/>
+        </w:rPr>
+        <w:t xml:space="preserve">ultimo_resumo_em</w:t>
+      </w:r>
+      <w:r>
+        <w:t xml:space="preserve">) com a de hoje (um dia, sete dias ou um mês, sem estourar o fim do mês). A data só é gravada quando o e-mail de fato sai; se o envio falhar, a verificação seguinte tenta de novo. O valor é validado no servidor (valor desconhecido é recusado), e uma atualização parcial do perfil não apaga a preferência.</w:t>
       </w:r>
     </w:p>
     <w:p>

</xml_diff>